<commit_message>
Implement add and delete authData
</commit_message>
<xml_diff>
--- a/server/SQL Database table formatting.docx
+++ b/server/SQL Database table formatting.docx
@@ -4,7 +4,7 @@
   <w:body>
     <w:tbl>
       <w:tblPr>
-        <w:tblStyle w:val="12"/>
+        <w:tblStyle w:val="701"/>
         <w:tblW w:w="0" w:type="auto"/>
         <w:tblBorders/>
         <w:tblLook w:val="04A0" w:firstRow="1" w:lastRow="0" w:firstColumn="1" w:lastColumn="0" w:noHBand="0" w:noVBand="1"/>
@@ -126,8 +126,98 @@
       </w:pPr>
       <w:r/>
       <w:r/>
-      <w:r/>
     </w:p>
+    <w:tbl>
+      <w:tblPr>
+        <w:tblStyle w:val="701"/>
+        <w:tblW w:w="0" w:type="auto"/>
+        <w:tblBorders/>
+        <w:tblLook w:val="04A0" w:firstRow="1" w:lastRow="0" w:firstColumn="1" w:lastColumn="0" w:noHBand="0" w:noVBand="1"/>
+      </w:tblPr>
+      <w:tblGrid>
+        <w:gridCol w:w="4680"/>
+        <w:gridCol w:w="4680"/>
+      </w:tblGrid>
+      <w:tr>
+        <w:trPr/>
+        <w:tc>
+          <w:tcPr>
+            <w:gridSpan w:val="2"/>
+            <w:tcBorders/>
+            <w:tcMar>
+              <w:left w:w="108" w:type="dxa"/>
+              <w:top w:w="144" w:type="dxa"/>
+              <w:right w:w="108" w:type="dxa"/>
+              <w:bottom w:w="144" w:type="dxa"/>
+            </w:tcMar>
+            <w:tcW w:w="9360" w:type="dxa"/>
+          </w:tcPr>
+          <w:p>
+            <w:pPr>
+              <w:spacing/>
+              <w:ind/>
+              <w:jc w:val="center"/>
+              <w:rPr/>
+            </w:pPr>
+            <w:r>
+              <w:t xml:space="preserve">AuthData</w:t>
+            </w:r>
+            <w:r/>
+          </w:p>
+        </w:tc>
+      </w:tr>
+      <w:tr>
+        <w:trPr/>
+        <w:tc>
+          <w:tcPr>
+            <w:tcBorders/>
+            <w:tcMar>
+              <w:left w:w="108" w:type="dxa"/>
+              <w:top w:w="144" w:type="dxa"/>
+              <w:right w:w="108" w:type="dxa"/>
+              <w:bottom w:w="144" w:type="dxa"/>
+            </w:tcMar>
+            <w:tcW w:w="4680" w:type="dxa"/>
+          </w:tcPr>
+          <w:p>
+            <w:pPr>
+              <w:spacing/>
+              <w:ind/>
+              <w:jc w:val="center"/>
+              <w:rPr/>
+            </w:pPr>
+            <w:r>
+              <w:t xml:space="preserve">AuthToken</w:t>
+            </w:r>
+            <w:r/>
+          </w:p>
+        </w:tc>
+        <w:tc>
+          <w:tcPr>
+            <w:tcBorders/>
+            <w:tcMar>
+              <w:left w:w="108" w:type="dxa"/>
+              <w:top w:w="144" w:type="dxa"/>
+              <w:right w:w="108" w:type="dxa"/>
+              <w:bottom w:w="144" w:type="dxa"/>
+            </w:tcMar>
+            <w:tcW w:w="4680" w:type="dxa"/>
+          </w:tcPr>
+          <w:p>
+            <w:pPr>
+              <w:spacing/>
+              <w:ind/>
+              <w:jc w:val="center"/>
+              <w:rPr/>
+            </w:pPr>
+            <w:r>
+              <w:t xml:space="preserve">Username</w:t>
+            </w:r>
+            <w:r/>
+          </w:p>
+        </w:tc>
+      </w:tr>
+    </w:tbl>
     <w:p>
       <w:pPr>
         <w:spacing/>
@@ -158,7 +248,6 @@
         <w:ind/>
         <w:rPr/>
       </w:pPr>
-      <w:r/>
       <w:r>
         <w:separator/>
       </w:r>
@@ -172,7 +261,6 @@
         <w:ind/>
         <w:rPr/>
       </w:pPr>
-      <w:r/>
       <w:r>
         <w:continuationSeparator/>
       </w:r>
@@ -191,7 +279,6 @@
         <w:ind/>
         <w:rPr/>
       </w:pPr>
-      <w:r/>
       <w:r>
         <w:separator/>
       </w:r>
@@ -205,7 +292,6 @@
         <w:ind/>
         <w:rPr/>
       </w:pPr>
-      <w:r/>
       <w:r>
         <w:continuationSeparator/>
       </w:r>
@@ -373,9 +459,9 @@
     <w:lsdException w:name="Bibliography" w:uiPriority="37"/>
     <w:lsdException w:name="TOC Heading" w:uiPriority="39" w:qFormat="1"/>
   </w:latentStyles>
-  <w:style w:type="table" w:styleId="12">
+  <w:style w:type="table" w:styleId="701">
     <w:name w:val="Table Grid"/>
-    <w:basedOn w:val="665"/>
+    <w:basedOn w:val="887"/>
     <w:uiPriority w:val="59"/>
     <w:pPr>
       <w:pBdr/>
@@ -572,9 +658,9 @@
       </w:tcPr>
     </w:tblStylePr>
   </w:style>
-  <w:style w:type="table" w:styleId="13">
+  <w:style w:type="table" w:styleId="702">
     <w:name w:val="Table Grid Light"/>
-    <w:basedOn w:val="665"/>
+    <w:basedOn w:val="887"/>
     <w:uiPriority w:val="59"/>
     <w:pPr>
       <w:pBdr/>
@@ -771,9 +857,9 @@
       </w:tcPr>
     </w:tblStylePr>
   </w:style>
-  <w:style w:type="table" w:styleId="14">
+  <w:style w:type="table" w:styleId="703">
     <w:name w:val="Plain Table 1"/>
-    <w:basedOn w:val="665"/>
+    <w:basedOn w:val="887"/>
     <w:uiPriority w:val="59"/>
     <w:pPr>
       <w:pBdr/>
@@ -996,9 +1082,9 @@
       </w:tcPr>
     </w:tblStylePr>
   </w:style>
-  <w:style w:type="table" w:styleId="15">
+  <w:style w:type="table" w:styleId="704">
     <w:name w:val="Plain Table 2"/>
-    <w:basedOn w:val="665"/>
+    <w:basedOn w:val="887"/>
     <w:uiPriority w:val="59"/>
     <w:pPr>
       <w:pBdr/>
@@ -1229,9 +1315,9 @@
       </w:tcPr>
     </w:tblStylePr>
   </w:style>
-  <w:style w:type="table" w:styleId="16">
+  <w:style w:type="table" w:styleId="705">
     <w:name w:val="Plain Table 3"/>
-    <w:basedOn w:val="665"/>
+    <w:basedOn w:val="887"/>
     <w:uiPriority w:val="99"/>
     <w:pPr>
       <w:pBdr/>
@@ -1459,9 +1545,9 @@
       </w:tcPr>
     </w:tblStylePr>
   </w:style>
-  <w:style w:type="table" w:styleId="17">
+  <w:style w:type="table" w:styleId="706">
     <w:name w:val="Plain Table 4"/>
-    <w:basedOn w:val="665"/>
+    <w:basedOn w:val="887"/>
     <w:uiPriority w:val="99"/>
     <w:pPr>
       <w:pBdr/>
@@ -1675,9 +1761,9 @@
       </w:tcPr>
     </w:tblStylePr>
   </w:style>
-  <w:style w:type="table" w:styleId="18">
+  <w:style w:type="table" w:styleId="707">
     <w:name w:val="Plain Table 5"/>
-    <w:basedOn w:val="665"/>
+    <w:basedOn w:val="887"/>
     <w:uiPriority w:val="99"/>
     <w:pPr>
       <w:pBdr/>
@@ -1908,9 +1994,9 @@
       </w:tcPr>
     </w:tblStylePr>
   </w:style>
-  <w:style w:type="table" w:styleId="19">
+  <w:style w:type="table" w:styleId="708">
     <w:name w:val="Grid Table 1 Light"/>
-    <w:basedOn w:val="665"/>
+    <w:basedOn w:val="887"/>
     <w:uiPriority w:val="99"/>
     <w:pPr>
       <w:pBdr/>
@@ -2131,9 +2217,9 @@
       </w:tcPr>
     </w:tblStylePr>
   </w:style>
-  <w:style w:type="table" w:styleId="20">
+  <w:style w:type="table" w:styleId="709">
     <w:name w:val="Grid Table 1 Light - Accent 1"/>
-    <w:basedOn w:val="665"/>
+    <w:basedOn w:val="887"/>
     <w:uiPriority w:val="99"/>
     <w:pPr>
       <w:pBdr/>
@@ -2354,9 +2440,9 @@
       </w:tcPr>
     </w:tblStylePr>
   </w:style>
-  <w:style w:type="table" w:styleId="21">
+  <w:style w:type="table" w:styleId="710">
     <w:name w:val="Grid Table 1 Light - Accent 2"/>
-    <w:basedOn w:val="665"/>
+    <w:basedOn w:val="887"/>
     <w:uiPriority w:val="99"/>
     <w:pPr>
       <w:pBdr/>
@@ -2577,9 +2663,9 @@
       </w:tcPr>
     </w:tblStylePr>
   </w:style>
-  <w:style w:type="table" w:styleId="22">
+  <w:style w:type="table" w:styleId="711">
     <w:name w:val="Grid Table 1 Light - Accent 3"/>
-    <w:basedOn w:val="665"/>
+    <w:basedOn w:val="887"/>
     <w:uiPriority w:val="99"/>
     <w:pPr>
       <w:pBdr/>
@@ -2800,9 +2886,9 @@
       </w:tcPr>
     </w:tblStylePr>
   </w:style>
-  <w:style w:type="table" w:styleId="23">
+  <w:style w:type="table" w:styleId="712">
     <w:name w:val="Grid Table 1 Light - Accent 4"/>
-    <w:basedOn w:val="665"/>
+    <w:basedOn w:val="887"/>
     <w:uiPriority w:val="99"/>
     <w:pPr>
       <w:pBdr/>
@@ -3023,9 +3109,9 @@
       </w:tcPr>
     </w:tblStylePr>
   </w:style>
-  <w:style w:type="table" w:styleId="24">
+  <w:style w:type="table" w:styleId="713">
     <w:name w:val="Grid Table 1 Light - Accent 5"/>
-    <w:basedOn w:val="665"/>
+    <w:basedOn w:val="887"/>
     <w:uiPriority w:val="99"/>
     <w:pPr>
       <w:pBdr/>
@@ -3246,9 +3332,9 @@
       </w:tcPr>
     </w:tblStylePr>
   </w:style>
-  <w:style w:type="table" w:styleId="25">
+  <w:style w:type="table" w:styleId="714">
     <w:name w:val="Grid Table 1 Light - Accent 6"/>
-    <w:basedOn w:val="665"/>
+    <w:basedOn w:val="887"/>
     <w:uiPriority w:val="99"/>
     <w:pPr>
       <w:pBdr/>
@@ -3469,9 +3555,9 @@
       </w:tcPr>
     </w:tblStylePr>
   </w:style>
-  <w:style w:type="table" w:styleId="26">
+  <w:style w:type="table" w:styleId="715">
     <w:name w:val="Grid Table 2"/>
-    <w:basedOn w:val="665"/>
+    <w:basedOn w:val="887"/>
     <w:uiPriority w:val="99"/>
     <w:pPr>
       <w:pBdr/>
@@ -3701,9 +3787,9 @@
       </w:tcPr>
     </w:tblStylePr>
   </w:style>
-  <w:style w:type="table" w:styleId="27">
+  <w:style w:type="table" w:styleId="716">
     <w:name w:val="Grid Table 2 - Accent 1"/>
-    <w:basedOn w:val="665"/>
+    <w:basedOn w:val="887"/>
     <w:uiPriority w:val="99"/>
     <w:pPr>
       <w:pBdr/>
@@ -3933,9 +4019,9 @@
       </w:tcPr>
     </w:tblStylePr>
   </w:style>
-  <w:style w:type="table" w:styleId="28">
+  <w:style w:type="table" w:styleId="717">
     <w:name w:val="Grid Table 2 - Accent 2"/>
-    <w:basedOn w:val="665"/>
+    <w:basedOn w:val="887"/>
     <w:uiPriority w:val="99"/>
     <w:pPr>
       <w:pBdr/>
@@ -4165,9 +4251,9 @@
       </w:tcPr>
     </w:tblStylePr>
   </w:style>
-  <w:style w:type="table" w:styleId="29">
+  <w:style w:type="table" w:styleId="718">
     <w:name w:val="Grid Table 2 - Accent 3"/>
-    <w:basedOn w:val="665"/>
+    <w:basedOn w:val="887"/>
     <w:uiPriority w:val="99"/>
     <w:pPr>
       <w:pBdr/>
@@ -4397,9 +4483,9 @@
       </w:tcPr>
     </w:tblStylePr>
   </w:style>
-  <w:style w:type="table" w:styleId="30">
+  <w:style w:type="table" w:styleId="719">
     <w:name w:val="Grid Table 2 - Accent 4"/>
-    <w:basedOn w:val="665"/>
+    <w:basedOn w:val="887"/>
     <w:uiPriority w:val="99"/>
     <w:pPr>
       <w:pBdr/>
@@ -4629,9 +4715,9 @@
       </w:tcPr>
     </w:tblStylePr>
   </w:style>
-  <w:style w:type="table" w:styleId="31">
+  <w:style w:type="table" w:styleId="720">
     <w:name w:val="Grid Table 2 - Accent 5"/>
-    <w:basedOn w:val="665"/>
+    <w:basedOn w:val="887"/>
     <w:uiPriority w:val="99"/>
     <w:pPr>
       <w:pBdr/>
@@ -4861,9 +4947,9 @@
       </w:tcPr>
     </w:tblStylePr>
   </w:style>
-  <w:style w:type="table" w:styleId="32">
+  <w:style w:type="table" w:styleId="721">
     <w:name w:val="Grid Table 2 - Accent 6"/>
-    <w:basedOn w:val="665"/>
+    <w:basedOn w:val="887"/>
     <w:uiPriority w:val="99"/>
     <w:pPr>
       <w:pBdr/>
@@ -5093,9 +5179,9 @@
       </w:tcPr>
     </w:tblStylePr>
   </w:style>
-  <w:style w:type="table" w:styleId="33">
+  <w:style w:type="table" w:styleId="722">
     <w:name w:val="Grid Table 3"/>
-    <w:basedOn w:val="665"/>
+    <w:basedOn w:val="887"/>
     <w:uiPriority w:val="99"/>
     <w:pPr>
       <w:pBdr/>
@@ -5194,29 +5280,6 @@
         <w:tblBorders/>
       </w:tblPr>
       <w:tcPr>
-        <w:shd w:color="ffffff"/>
-        <w:tcBorders>
-          <w:top w:val="none" w:color="000000" w:sz="4" w:space="0"/>
-          <w:left w:val="none" w:color="000000" w:sz="4" w:space="0"/>
-          <w:bottom w:val="none" w:color="000000" w:sz="4" w:space="0"/>
-          <w:right w:val="none" w:color="000000" w:sz="4" w:space="0"/>
-        </w:tcBorders>
-      </w:tcPr>
-    </w:tblStylePr>
-    <w:tblStylePr w:type="firstRow">
-      <w:rPr>
-        <w:b/>
-        <w:color w:val="404040"/>
-      </w:rPr>
-      <w:pPr>
-        <w:pBdr/>
-        <w:spacing/>
-        <w:ind/>
-      </w:pPr>
-      <w:tblPr>
-        <w:tblBorders/>
-      </w:tblPr>
-      <w:tcPr>
         <w:shd w:val="clear" w:color="ffffff"/>
         <w:tcBorders>
           <w:top w:val="none" w:color="000000" w:sz="4" w:space="0"/>
@@ -5226,30 +5289,7 @@
         </w:tcBorders>
       </w:tcPr>
     </w:tblStylePr>
-    <w:tblStylePr w:type="lastCol">
-      <w:rPr>
-        <w:i/>
-        <w:color w:val="404040"/>
-      </w:rPr>
-      <w:pPr>
-        <w:pBdr/>
-        <w:spacing/>
-        <w:ind/>
-      </w:pPr>
-      <w:tblPr>
-        <w:tblBorders/>
-      </w:tblPr>
-      <w:tcPr>
-        <w:shd w:color="ffffff"/>
-        <w:tcBorders>
-          <w:top w:val="none" w:color="000000" w:sz="4" w:space="0"/>
-          <w:left w:val="none" w:color="000000" w:sz="4" w:space="0"/>
-          <w:bottom w:val="none" w:color="000000" w:sz="4" w:space="0"/>
-          <w:right w:val="none" w:color="000000" w:sz="4" w:space="0"/>
-        </w:tcBorders>
-      </w:tcPr>
-    </w:tblStylePr>
-    <w:tblStylePr w:type="lastRow">
+    <w:tblStylePr w:type="firstRow">
       <w:rPr>
         <w:b/>
         <w:color w:val="404040"/>
@@ -5272,6 +5312,52 @@
         </w:tcBorders>
       </w:tcPr>
     </w:tblStylePr>
+    <w:tblStylePr w:type="lastCol">
+      <w:rPr>
+        <w:i/>
+        <w:color w:val="404040"/>
+      </w:rPr>
+      <w:pPr>
+        <w:pBdr/>
+        <w:spacing/>
+        <w:ind/>
+      </w:pPr>
+      <w:tblPr>
+        <w:tblBorders/>
+      </w:tblPr>
+      <w:tcPr>
+        <w:shd w:val="clear" w:color="ffffff"/>
+        <w:tcBorders>
+          <w:top w:val="none" w:color="000000" w:sz="4" w:space="0"/>
+          <w:left w:val="none" w:color="000000" w:sz="4" w:space="0"/>
+          <w:bottom w:val="none" w:color="000000" w:sz="4" w:space="0"/>
+          <w:right w:val="none" w:color="000000" w:sz="4" w:space="0"/>
+        </w:tcBorders>
+      </w:tcPr>
+    </w:tblStylePr>
+    <w:tblStylePr w:type="lastRow">
+      <w:rPr>
+        <w:b/>
+        <w:color w:val="404040"/>
+      </w:rPr>
+      <w:pPr>
+        <w:pBdr/>
+        <w:spacing/>
+        <w:ind/>
+      </w:pPr>
+      <w:tblPr>
+        <w:tblBorders/>
+      </w:tblPr>
+      <w:tcPr>
+        <w:shd w:val="clear" w:color="ffffff"/>
+        <w:tcBorders>
+          <w:top w:val="none" w:color="000000" w:sz="4" w:space="0"/>
+          <w:left w:val="none" w:color="000000" w:sz="4" w:space="0"/>
+          <w:bottom w:val="none" w:color="000000" w:sz="4" w:space="0"/>
+          <w:right w:val="none" w:color="000000" w:sz="4" w:space="0"/>
+        </w:tcBorders>
+      </w:tcPr>
+    </w:tblStylePr>
     <w:tblStylePr w:type="nwCell">
       <w:pPr>
         <w:pBdr/>
@@ -5338,9 +5424,9 @@
       </w:tcPr>
     </w:tblStylePr>
   </w:style>
-  <w:style w:type="table" w:styleId="34">
+  <w:style w:type="table" w:styleId="723">
     <w:name w:val="Grid Table 3 - Accent 1"/>
-    <w:basedOn w:val="665"/>
+    <w:basedOn w:val="887"/>
     <w:uiPriority w:val="99"/>
     <w:pPr>
       <w:pBdr/>
@@ -5439,29 +5525,6 @@
         <w:tblBorders/>
       </w:tblPr>
       <w:tcPr>
-        <w:shd w:color="ffffff"/>
-        <w:tcBorders>
-          <w:top w:val="none" w:color="000000" w:sz="4" w:space="0"/>
-          <w:left w:val="none" w:color="000000" w:sz="4" w:space="0"/>
-          <w:bottom w:val="none" w:color="000000" w:sz="4" w:space="0"/>
-          <w:right w:val="none" w:color="000000" w:sz="4" w:space="0"/>
-        </w:tcBorders>
-      </w:tcPr>
-    </w:tblStylePr>
-    <w:tblStylePr w:type="firstRow">
-      <w:rPr>
-        <w:b/>
-        <w:color w:val="404040"/>
-      </w:rPr>
-      <w:pPr>
-        <w:pBdr/>
-        <w:spacing/>
-        <w:ind/>
-      </w:pPr>
-      <w:tblPr>
-        <w:tblBorders/>
-      </w:tblPr>
-      <w:tcPr>
         <w:shd w:val="clear" w:color="ffffff"/>
         <w:tcBorders>
           <w:top w:val="none" w:color="000000" w:sz="4" w:space="0"/>
@@ -5471,30 +5534,7 @@
         </w:tcBorders>
       </w:tcPr>
     </w:tblStylePr>
-    <w:tblStylePr w:type="lastCol">
-      <w:rPr>
-        <w:i/>
-        <w:color w:val="404040"/>
-      </w:rPr>
-      <w:pPr>
-        <w:pBdr/>
-        <w:spacing/>
-        <w:ind/>
-      </w:pPr>
-      <w:tblPr>
-        <w:tblBorders/>
-      </w:tblPr>
-      <w:tcPr>
-        <w:shd w:color="ffffff"/>
-        <w:tcBorders>
-          <w:top w:val="none" w:color="000000" w:sz="4" w:space="0"/>
-          <w:left w:val="none" w:color="000000" w:sz="4" w:space="0"/>
-          <w:bottom w:val="none" w:color="000000" w:sz="4" w:space="0"/>
-          <w:right w:val="none" w:color="000000" w:sz="4" w:space="0"/>
-        </w:tcBorders>
-      </w:tcPr>
-    </w:tblStylePr>
-    <w:tblStylePr w:type="lastRow">
+    <w:tblStylePr w:type="firstRow">
       <w:rPr>
         <w:b/>
         <w:color w:val="404040"/>
@@ -5517,6 +5557,52 @@
         </w:tcBorders>
       </w:tcPr>
     </w:tblStylePr>
+    <w:tblStylePr w:type="lastCol">
+      <w:rPr>
+        <w:i/>
+        <w:color w:val="404040"/>
+      </w:rPr>
+      <w:pPr>
+        <w:pBdr/>
+        <w:spacing/>
+        <w:ind/>
+      </w:pPr>
+      <w:tblPr>
+        <w:tblBorders/>
+      </w:tblPr>
+      <w:tcPr>
+        <w:shd w:val="clear" w:color="ffffff"/>
+        <w:tcBorders>
+          <w:top w:val="none" w:color="000000" w:sz="4" w:space="0"/>
+          <w:left w:val="none" w:color="000000" w:sz="4" w:space="0"/>
+          <w:bottom w:val="none" w:color="000000" w:sz="4" w:space="0"/>
+          <w:right w:val="none" w:color="000000" w:sz="4" w:space="0"/>
+        </w:tcBorders>
+      </w:tcPr>
+    </w:tblStylePr>
+    <w:tblStylePr w:type="lastRow">
+      <w:rPr>
+        <w:b/>
+        <w:color w:val="404040"/>
+      </w:rPr>
+      <w:pPr>
+        <w:pBdr/>
+        <w:spacing/>
+        <w:ind/>
+      </w:pPr>
+      <w:tblPr>
+        <w:tblBorders/>
+      </w:tblPr>
+      <w:tcPr>
+        <w:shd w:val="clear" w:color="ffffff"/>
+        <w:tcBorders>
+          <w:top w:val="none" w:color="000000" w:sz="4" w:space="0"/>
+          <w:left w:val="none" w:color="000000" w:sz="4" w:space="0"/>
+          <w:bottom w:val="none" w:color="000000" w:sz="4" w:space="0"/>
+          <w:right w:val="none" w:color="000000" w:sz="4" w:space="0"/>
+        </w:tcBorders>
+      </w:tcPr>
+    </w:tblStylePr>
     <w:tblStylePr w:type="nwCell">
       <w:pPr>
         <w:pBdr/>
@@ -5583,9 +5669,9 @@
       </w:tcPr>
     </w:tblStylePr>
   </w:style>
-  <w:style w:type="table" w:styleId="35">
+  <w:style w:type="table" w:styleId="724">
     <w:name w:val="Grid Table 3 - Accent 2"/>
-    <w:basedOn w:val="665"/>
+    <w:basedOn w:val="887"/>
     <w:uiPriority w:val="99"/>
     <w:pPr>
       <w:pBdr/>
@@ -5684,29 +5770,6 @@
         <w:tblBorders/>
       </w:tblPr>
       <w:tcPr>
-        <w:shd w:color="ffffff"/>
-        <w:tcBorders>
-          <w:top w:val="none" w:color="000000" w:sz="4" w:space="0"/>
-          <w:left w:val="none" w:color="000000" w:sz="4" w:space="0"/>
-          <w:bottom w:val="none" w:color="000000" w:sz="4" w:space="0"/>
-          <w:right w:val="none" w:color="000000" w:sz="4" w:space="0"/>
-        </w:tcBorders>
-      </w:tcPr>
-    </w:tblStylePr>
-    <w:tblStylePr w:type="firstRow">
-      <w:rPr>
-        <w:b/>
-        <w:color w:val="404040"/>
-      </w:rPr>
-      <w:pPr>
-        <w:pBdr/>
-        <w:spacing/>
-        <w:ind/>
-      </w:pPr>
-      <w:tblPr>
-        <w:tblBorders/>
-      </w:tblPr>
-      <w:tcPr>
         <w:shd w:val="clear" w:color="ffffff"/>
         <w:tcBorders>
           <w:top w:val="none" w:color="000000" w:sz="4" w:space="0"/>
@@ -5716,30 +5779,7 @@
         </w:tcBorders>
       </w:tcPr>
     </w:tblStylePr>
-    <w:tblStylePr w:type="lastCol">
-      <w:rPr>
-        <w:i/>
-        <w:color w:val="404040"/>
-      </w:rPr>
-      <w:pPr>
-        <w:pBdr/>
-        <w:spacing/>
-        <w:ind/>
-      </w:pPr>
-      <w:tblPr>
-        <w:tblBorders/>
-      </w:tblPr>
-      <w:tcPr>
-        <w:shd w:color="ffffff"/>
-        <w:tcBorders>
-          <w:top w:val="none" w:color="000000" w:sz="4" w:space="0"/>
-          <w:left w:val="none" w:color="000000" w:sz="4" w:space="0"/>
-          <w:bottom w:val="none" w:color="000000" w:sz="4" w:space="0"/>
-          <w:right w:val="none" w:color="000000" w:sz="4" w:space="0"/>
-        </w:tcBorders>
-      </w:tcPr>
-    </w:tblStylePr>
-    <w:tblStylePr w:type="lastRow">
+    <w:tblStylePr w:type="firstRow">
       <w:rPr>
         <w:b/>
         <w:color w:val="404040"/>
@@ -5762,6 +5802,52 @@
         </w:tcBorders>
       </w:tcPr>
     </w:tblStylePr>
+    <w:tblStylePr w:type="lastCol">
+      <w:rPr>
+        <w:i/>
+        <w:color w:val="404040"/>
+      </w:rPr>
+      <w:pPr>
+        <w:pBdr/>
+        <w:spacing/>
+        <w:ind/>
+      </w:pPr>
+      <w:tblPr>
+        <w:tblBorders/>
+      </w:tblPr>
+      <w:tcPr>
+        <w:shd w:val="clear" w:color="ffffff"/>
+        <w:tcBorders>
+          <w:top w:val="none" w:color="000000" w:sz="4" w:space="0"/>
+          <w:left w:val="none" w:color="000000" w:sz="4" w:space="0"/>
+          <w:bottom w:val="none" w:color="000000" w:sz="4" w:space="0"/>
+          <w:right w:val="none" w:color="000000" w:sz="4" w:space="0"/>
+        </w:tcBorders>
+      </w:tcPr>
+    </w:tblStylePr>
+    <w:tblStylePr w:type="lastRow">
+      <w:rPr>
+        <w:b/>
+        <w:color w:val="404040"/>
+      </w:rPr>
+      <w:pPr>
+        <w:pBdr/>
+        <w:spacing/>
+        <w:ind/>
+      </w:pPr>
+      <w:tblPr>
+        <w:tblBorders/>
+      </w:tblPr>
+      <w:tcPr>
+        <w:shd w:val="clear" w:color="ffffff"/>
+        <w:tcBorders>
+          <w:top w:val="none" w:color="000000" w:sz="4" w:space="0"/>
+          <w:left w:val="none" w:color="000000" w:sz="4" w:space="0"/>
+          <w:bottom w:val="none" w:color="000000" w:sz="4" w:space="0"/>
+          <w:right w:val="none" w:color="000000" w:sz="4" w:space="0"/>
+        </w:tcBorders>
+      </w:tcPr>
+    </w:tblStylePr>
     <w:tblStylePr w:type="nwCell">
       <w:pPr>
         <w:pBdr/>
@@ -5828,9 +5914,9 @@
       </w:tcPr>
     </w:tblStylePr>
   </w:style>
-  <w:style w:type="table" w:styleId="36">
+  <w:style w:type="table" w:styleId="725">
     <w:name w:val="Grid Table 3 - Accent 3"/>
-    <w:basedOn w:val="665"/>
+    <w:basedOn w:val="887"/>
     <w:uiPriority w:val="99"/>
     <w:pPr>
       <w:pBdr/>
@@ -5929,29 +6015,6 @@
         <w:tblBorders/>
       </w:tblPr>
       <w:tcPr>
-        <w:shd w:color="ffffff"/>
-        <w:tcBorders>
-          <w:top w:val="none" w:color="000000" w:sz="4" w:space="0"/>
-          <w:left w:val="none" w:color="000000" w:sz="4" w:space="0"/>
-          <w:bottom w:val="none" w:color="000000" w:sz="4" w:space="0"/>
-          <w:right w:val="none" w:color="000000" w:sz="4" w:space="0"/>
-        </w:tcBorders>
-      </w:tcPr>
-    </w:tblStylePr>
-    <w:tblStylePr w:type="firstRow">
-      <w:rPr>
-        <w:b/>
-        <w:color w:val="404040"/>
-      </w:rPr>
-      <w:pPr>
-        <w:pBdr/>
-        <w:spacing/>
-        <w:ind/>
-      </w:pPr>
-      <w:tblPr>
-        <w:tblBorders/>
-      </w:tblPr>
-      <w:tcPr>
         <w:shd w:val="clear" w:color="ffffff"/>
         <w:tcBorders>
           <w:top w:val="none" w:color="000000" w:sz="4" w:space="0"/>
@@ -5961,30 +6024,7 @@
         </w:tcBorders>
       </w:tcPr>
     </w:tblStylePr>
-    <w:tblStylePr w:type="lastCol">
-      <w:rPr>
-        <w:i/>
-        <w:color w:val="404040"/>
-      </w:rPr>
-      <w:pPr>
-        <w:pBdr/>
-        <w:spacing/>
-        <w:ind/>
-      </w:pPr>
-      <w:tblPr>
-        <w:tblBorders/>
-      </w:tblPr>
-      <w:tcPr>
-        <w:shd w:color="ffffff"/>
-        <w:tcBorders>
-          <w:top w:val="none" w:color="000000" w:sz="4" w:space="0"/>
-          <w:left w:val="none" w:color="000000" w:sz="4" w:space="0"/>
-          <w:bottom w:val="none" w:color="000000" w:sz="4" w:space="0"/>
-          <w:right w:val="none" w:color="000000" w:sz="4" w:space="0"/>
-        </w:tcBorders>
-      </w:tcPr>
-    </w:tblStylePr>
-    <w:tblStylePr w:type="lastRow">
+    <w:tblStylePr w:type="firstRow">
       <w:rPr>
         <w:b/>
         <w:color w:val="404040"/>
@@ -6007,6 +6047,52 @@
         </w:tcBorders>
       </w:tcPr>
     </w:tblStylePr>
+    <w:tblStylePr w:type="lastCol">
+      <w:rPr>
+        <w:i/>
+        <w:color w:val="404040"/>
+      </w:rPr>
+      <w:pPr>
+        <w:pBdr/>
+        <w:spacing/>
+        <w:ind/>
+      </w:pPr>
+      <w:tblPr>
+        <w:tblBorders/>
+      </w:tblPr>
+      <w:tcPr>
+        <w:shd w:val="clear" w:color="ffffff"/>
+        <w:tcBorders>
+          <w:top w:val="none" w:color="000000" w:sz="4" w:space="0"/>
+          <w:left w:val="none" w:color="000000" w:sz="4" w:space="0"/>
+          <w:bottom w:val="none" w:color="000000" w:sz="4" w:space="0"/>
+          <w:right w:val="none" w:color="000000" w:sz="4" w:space="0"/>
+        </w:tcBorders>
+      </w:tcPr>
+    </w:tblStylePr>
+    <w:tblStylePr w:type="lastRow">
+      <w:rPr>
+        <w:b/>
+        <w:color w:val="404040"/>
+      </w:rPr>
+      <w:pPr>
+        <w:pBdr/>
+        <w:spacing/>
+        <w:ind/>
+      </w:pPr>
+      <w:tblPr>
+        <w:tblBorders/>
+      </w:tblPr>
+      <w:tcPr>
+        <w:shd w:val="clear" w:color="ffffff"/>
+        <w:tcBorders>
+          <w:top w:val="none" w:color="000000" w:sz="4" w:space="0"/>
+          <w:left w:val="none" w:color="000000" w:sz="4" w:space="0"/>
+          <w:bottom w:val="none" w:color="000000" w:sz="4" w:space="0"/>
+          <w:right w:val="none" w:color="000000" w:sz="4" w:space="0"/>
+        </w:tcBorders>
+      </w:tcPr>
+    </w:tblStylePr>
     <w:tblStylePr w:type="nwCell">
       <w:pPr>
         <w:pBdr/>
@@ -6073,9 +6159,9 @@
       </w:tcPr>
     </w:tblStylePr>
   </w:style>
-  <w:style w:type="table" w:styleId="37">
+  <w:style w:type="table" w:styleId="726">
     <w:name w:val="Grid Table 3 - Accent 4"/>
-    <w:basedOn w:val="665"/>
+    <w:basedOn w:val="887"/>
     <w:uiPriority w:val="99"/>
     <w:pPr>
       <w:pBdr/>
@@ -6174,29 +6260,6 @@
         <w:tblBorders/>
       </w:tblPr>
       <w:tcPr>
-        <w:shd w:color="ffffff"/>
-        <w:tcBorders>
-          <w:top w:val="none" w:color="000000" w:sz="4" w:space="0"/>
-          <w:left w:val="none" w:color="000000" w:sz="4" w:space="0"/>
-          <w:bottom w:val="none" w:color="000000" w:sz="4" w:space="0"/>
-          <w:right w:val="none" w:color="000000" w:sz="4" w:space="0"/>
-        </w:tcBorders>
-      </w:tcPr>
-    </w:tblStylePr>
-    <w:tblStylePr w:type="firstRow">
-      <w:rPr>
-        <w:b/>
-        <w:color w:val="404040"/>
-      </w:rPr>
-      <w:pPr>
-        <w:pBdr/>
-        <w:spacing/>
-        <w:ind/>
-      </w:pPr>
-      <w:tblPr>
-        <w:tblBorders/>
-      </w:tblPr>
-      <w:tcPr>
         <w:shd w:val="clear" w:color="ffffff"/>
         <w:tcBorders>
           <w:top w:val="none" w:color="000000" w:sz="4" w:space="0"/>
@@ -6206,30 +6269,7 @@
         </w:tcBorders>
       </w:tcPr>
     </w:tblStylePr>
-    <w:tblStylePr w:type="lastCol">
-      <w:rPr>
-        <w:i/>
-        <w:color w:val="404040"/>
-      </w:rPr>
-      <w:pPr>
-        <w:pBdr/>
-        <w:spacing/>
-        <w:ind/>
-      </w:pPr>
-      <w:tblPr>
-        <w:tblBorders/>
-      </w:tblPr>
-      <w:tcPr>
-        <w:shd w:color="ffffff"/>
-        <w:tcBorders>
-          <w:top w:val="none" w:color="000000" w:sz="4" w:space="0"/>
-          <w:left w:val="none" w:color="000000" w:sz="4" w:space="0"/>
-          <w:bottom w:val="none" w:color="000000" w:sz="4" w:space="0"/>
-          <w:right w:val="none" w:color="000000" w:sz="4" w:space="0"/>
-        </w:tcBorders>
-      </w:tcPr>
-    </w:tblStylePr>
-    <w:tblStylePr w:type="lastRow">
+    <w:tblStylePr w:type="firstRow">
       <w:rPr>
         <w:b/>
         <w:color w:val="404040"/>
@@ -6252,6 +6292,52 @@
         </w:tcBorders>
       </w:tcPr>
     </w:tblStylePr>
+    <w:tblStylePr w:type="lastCol">
+      <w:rPr>
+        <w:i/>
+        <w:color w:val="404040"/>
+      </w:rPr>
+      <w:pPr>
+        <w:pBdr/>
+        <w:spacing/>
+        <w:ind/>
+      </w:pPr>
+      <w:tblPr>
+        <w:tblBorders/>
+      </w:tblPr>
+      <w:tcPr>
+        <w:shd w:val="clear" w:color="ffffff"/>
+        <w:tcBorders>
+          <w:top w:val="none" w:color="000000" w:sz="4" w:space="0"/>
+          <w:left w:val="none" w:color="000000" w:sz="4" w:space="0"/>
+          <w:bottom w:val="none" w:color="000000" w:sz="4" w:space="0"/>
+          <w:right w:val="none" w:color="000000" w:sz="4" w:space="0"/>
+        </w:tcBorders>
+      </w:tcPr>
+    </w:tblStylePr>
+    <w:tblStylePr w:type="lastRow">
+      <w:rPr>
+        <w:b/>
+        <w:color w:val="404040"/>
+      </w:rPr>
+      <w:pPr>
+        <w:pBdr/>
+        <w:spacing/>
+        <w:ind/>
+      </w:pPr>
+      <w:tblPr>
+        <w:tblBorders/>
+      </w:tblPr>
+      <w:tcPr>
+        <w:shd w:val="clear" w:color="ffffff"/>
+        <w:tcBorders>
+          <w:top w:val="none" w:color="000000" w:sz="4" w:space="0"/>
+          <w:left w:val="none" w:color="000000" w:sz="4" w:space="0"/>
+          <w:bottom w:val="none" w:color="000000" w:sz="4" w:space="0"/>
+          <w:right w:val="none" w:color="000000" w:sz="4" w:space="0"/>
+        </w:tcBorders>
+      </w:tcPr>
+    </w:tblStylePr>
     <w:tblStylePr w:type="nwCell">
       <w:pPr>
         <w:pBdr/>
@@ -6318,9 +6404,9 @@
       </w:tcPr>
     </w:tblStylePr>
   </w:style>
-  <w:style w:type="table" w:styleId="38">
+  <w:style w:type="table" w:styleId="727">
     <w:name w:val="Grid Table 3 - Accent 5"/>
-    <w:basedOn w:val="665"/>
+    <w:basedOn w:val="887"/>
     <w:uiPriority w:val="99"/>
     <w:pPr>
       <w:pBdr/>
@@ -6419,29 +6505,6 @@
         <w:tblBorders/>
       </w:tblPr>
       <w:tcPr>
-        <w:shd w:color="ffffff"/>
-        <w:tcBorders>
-          <w:top w:val="none" w:color="000000" w:sz="4" w:space="0"/>
-          <w:left w:val="none" w:color="000000" w:sz="4" w:space="0"/>
-          <w:bottom w:val="none" w:color="000000" w:sz="4" w:space="0"/>
-          <w:right w:val="none" w:color="000000" w:sz="4" w:space="0"/>
-        </w:tcBorders>
-      </w:tcPr>
-    </w:tblStylePr>
-    <w:tblStylePr w:type="firstRow">
-      <w:rPr>
-        <w:b/>
-        <w:color w:val="404040"/>
-      </w:rPr>
-      <w:pPr>
-        <w:pBdr/>
-        <w:spacing/>
-        <w:ind/>
-      </w:pPr>
-      <w:tblPr>
-        <w:tblBorders/>
-      </w:tblPr>
-      <w:tcPr>
         <w:shd w:val="clear" w:color="ffffff"/>
         <w:tcBorders>
           <w:top w:val="none" w:color="000000" w:sz="4" w:space="0"/>
@@ -6451,30 +6514,7 @@
         </w:tcBorders>
       </w:tcPr>
     </w:tblStylePr>
-    <w:tblStylePr w:type="lastCol">
-      <w:rPr>
-        <w:i/>
-        <w:color w:val="404040"/>
-      </w:rPr>
-      <w:pPr>
-        <w:pBdr/>
-        <w:spacing/>
-        <w:ind/>
-      </w:pPr>
-      <w:tblPr>
-        <w:tblBorders/>
-      </w:tblPr>
-      <w:tcPr>
-        <w:shd w:color="ffffff"/>
-        <w:tcBorders>
-          <w:top w:val="none" w:color="000000" w:sz="4" w:space="0"/>
-          <w:left w:val="none" w:color="000000" w:sz="4" w:space="0"/>
-          <w:bottom w:val="none" w:color="000000" w:sz="4" w:space="0"/>
-          <w:right w:val="none" w:color="000000" w:sz="4" w:space="0"/>
-        </w:tcBorders>
-      </w:tcPr>
-    </w:tblStylePr>
-    <w:tblStylePr w:type="lastRow">
+    <w:tblStylePr w:type="firstRow">
       <w:rPr>
         <w:b/>
         <w:color w:val="404040"/>
@@ -6497,6 +6537,52 @@
         </w:tcBorders>
       </w:tcPr>
     </w:tblStylePr>
+    <w:tblStylePr w:type="lastCol">
+      <w:rPr>
+        <w:i/>
+        <w:color w:val="404040"/>
+      </w:rPr>
+      <w:pPr>
+        <w:pBdr/>
+        <w:spacing/>
+        <w:ind/>
+      </w:pPr>
+      <w:tblPr>
+        <w:tblBorders/>
+      </w:tblPr>
+      <w:tcPr>
+        <w:shd w:val="clear" w:color="ffffff"/>
+        <w:tcBorders>
+          <w:top w:val="none" w:color="000000" w:sz="4" w:space="0"/>
+          <w:left w:val="none" w:color="000000" w:sz="4" w:space="0"/>
+          <w:bottom w:val="none" w:color="000000" w:sz="4" w:space="0"/>
+          <w:right w:val="none" w:color="000000" w:sz="4" w:space="0"/>
+        </w:tcBorders>
+      </w:tcPr>
+    </w:tblStylePr>
+    <w:tblStylePr w:type="lastRow">
+      <w:rPr>
+        <w:b/>
+        <w:color w:val="404040"/>
+      </w:rPr>
+      <w:pPr>
+        <w:pBdr/>
+        <w:spacing/>
+        <w:ind/>
+      </w:pPr>
+      <w:tblPr>
+        <w:tblBorders/>
+      </w:tblPr>
+      <w:tcPr>
+        <w:shd w:val="clear" w:color="ffffff"/>
+        <w:tcBorders>
+          <w:top w:val="none" w:color="000000" w:sz="4" w:space="0"/>
+          <w:left w:val="none" w:color="000000" w:sz="4" w:space="0"/>
+          <w:bottom w:val="none" w:color="000000" w:sz="4" w:space="0"/>
+          <w:right w:val="none" w:color="000000" w:sz="4" w:space="0"/>
+        </w:tcBorders>
+      </w:tcPr>
+    </w:tblStylePr>
     <w:tblStylePr w:type="nwCell">
       <w:pPr>
         <w:pBdr/>
@@ -6563,9 +6649,9 @@
       </w:tcPr>
     </w:tblStylePr>
   </w:style>
-  <w:style w:type="table" w:styleId="39">
+  <w:style w:type="table" w:styleId="728">
     <w:name w:val="Grid Table 3 - Accent 6"/>
-    <w:basedOn w:val="665"/>
+    <w:basedOn w:val="887"/>
     <w:uiPriority w:val="99"/>
     <w:pPr>
       <w:pBdr/>
@@ -6664,29 +6750,6 @@
         <w:tblBorders/>
       </w:tblPr>
       <w:tcPr>
-        <w:shd w:color="ffffff"/>
-        <w:tcBorders>
-          <w:top w:val="none" w:color="000000" w:sz="4" w:space="0"/>
-          <w:left w:val="none" w:color="000000" w:sz="4" w:space="0"/>
-          <w:bottom w:val="none" w:color="000000" w:sz="4" w:space="0"/>
-          <w:right w:val="none" w:color="000000" w:sz="4" w:space="0"/>
-        </w:tcBorders>
-      </w:tcPr>
-    </w:tblStylePr>
-    <w:tblStylePr w:type="firstRow">
-      <w:rPr>
-        <w:b/>
-        <w:color w:val="404040"/>
-      </w:rPr>
-      <w:pPr>
-        <w:pBdr/>
-        <w:spacing/>
-        <w:ind/>
-      </w:pPr>
-      <w:tblPr>
-        <w:tblBorders/>
-      </w:tblPr>
-      <w:tcPr>
         <w:shd w:val="clear" w:color="ffffff"/>
         <w:tcBorders>
           <w:top w:val="none" w:color="000000" w:sz="4" w:space="0"/>
@@ -6696,30 +6759,7 @@
         </w:tcBorders>
       </w:tcPr>
     </w:tblStylePr>
-    <w:tblStylePr w:type="lastCol">
-      <w:rPr>
-        <w:i/>
-        <w:color w:val="404040"/>
-      </w:rPr>
-      <w:pPr>
-        <w:pBdr/>
-        <w:spacing/>
-        <w:ind/>
-      </w:pPr>
-      <w:tblPr>
-        <w:tblBorders/>
-      </w:tblPr>
-      <w:tcPr>
-        <w:shd w:color="ffffff"/>
-        <w:tcBorders>
-          <w:top w:val="none" w:color="000000" w:sz="4" w:space="0"/>
-          <w:left w:val="none" w:color="000000" w:sz="4" w:space="0"/>
-          <w:bottom w:val="none" w:color="000000" w:sz="4" w:space="0"/>
-          <w:right w:val="none" w:color="000000" w:sz="4" w:space="0"/>
-        </w:tcBorders>
-      </w:tcPr>
-    </w:tblStylePr>
-    <w:tblStylePr w:type="lastRow">
+    <w:tblStylePr w:type="firstRow">
       <w:rPr>
         <w:b/>
         <w:color w:val="404040"/>
@@ -6742,6 +6782,52 @@
         </w:tcBorders>
       </w:tcPr>
     </w:tblStylePr>
+    <w:tblStylePr w:type="lastCol">
+      <w:rPr>
+        <w:i/>
+        <w:color w:val="404040"/>
+      </w:rPr>
+      <w:pPr>
+        <w:pBdr/>
+        <w:spacing/>
+        <w:ind/>
+      </w:pPr>
+      <w:tblPr>
+        <w:tblBorders/>
+      </w:tblPr>
+      <w:tcPr>
+        <w:shd w:val="clear" w:color="ffffff"/>
+        <w:tcBorders>
+          <w:top w:val="none" w:color="000000" w:sz="4" w:space="0"/>
+          <w:left w:val="none" w:color="000000" w:sz="4" w:space="0"/>
+          <w:bottom w:val="none" w:color="000000" w:sz="4" w:space="0"/>
+          <w:right w:val="none" w:color="000000" w:sz="4" w:space="0"/>
+        </w:tcBorders>
+      </w:tcPr>
+    </w:tblStylePr>
+    <w:tblStylePr w:type="lastRow">
+      <w:rPr>
+        <w:b/>
+        <w:color w:val="404040"/>
+      </w:rPr>
+      <w:pPr>
+        <w:pBdr/>
+        <w:spacing/>
+        <w:ind/>
+      </w:pPr>
+      <w:tblPr>
+        <w:tblBorders/>
+      </w:tblPr>
+      <w:tcPr>
+        <w:shd w:val="clear" w:color="ffffff"/>
+        <w:tcBorders>
+          <w:top w:val="none" w:color="000000" w:sz="4" w:space="0"/>
+          <w:left w:val="none" w:color="000000" w:sz="4" w:space="0"/>
+          <w:bottom w:val="none" w:color="000000" w:sz="4" w:space="0"/>
+          <w:right w:val="none" w:color="000000" w:sz="4" w:space="0"/>
+        </w:tcBorders>
+      </w:tcPr>
+    </w:tblStylePr>
     <w:tblStylePr w:type="nwCell">
       <w:pPr>
         <w:pBdr/>
@@ -6808,9 +6894,9 @@
       </w:tcPr>
     </w:tblStylePr>
   </w:style>
-  <w:style w:type="table" w:styleId="40">
+  <w:style w:type="table" w:styleId="729">
     <w:name w:val="Grid Table 4"/>
-    <w:basedOn w:val="665"/>
+    <w:basedOn w:val="887"/>
     <w:uiPriority w:val="59"/>
     <w:pPr>
       <w:pBdr/>
@@ -7041,9 +7127,9 @@
       </w:tcPr>
     </w:tblStylePr>
   </w:style>
-  <w:style w:type="table" w:styleId="41">
+  <w:style w:type="table" w:styleId="730">
     <w:name w:val="Grid Table 4 - Accent 1"/>
-    <w:basedOn w:val="665"/>
+    <w:basedOn w:val="887"/>
     <w:uiPriority w:val="59"/>
     <w:pPr>
       <w:pBdr/>
@@ -7274,9 +7360,9 @@
       </w:tcPr>
     </w:tblStylePr>
   </w:style>
-  <w:style w:type="table" w:styleId="42">
+  <w:style w:type="table" w:styleId="731">
     <w:name w:val="Grid Table 4 - Accent 2"/>
-    <w:basedOn w:val="665"/>
+    <w:basedOn w:val="887"/>
     <w:uiPriority w:val="59"/>
     <w:pPr>
       <w:pBdr/>
@@ -7507,9 +7593,9 @@
       </w:tcPr>
     </w:tblStylePr>
   </w:style>
-  <w:style w:type="table" w:styleId="43">
+  <w:style w:type="table" w:styleId="732">
     <w:name w:val="Grid Table 4 - Accent 3"/>
-    <w:basedOn w:val="665"/>
+    <w:basedOn w:val="887"/>
     <w:uiPriority w:val="59"/>
     <w:pPr>
       <w:pBdr/>
@@ -7740,9 +7826,9 @@
       </w:tcPr>
     </w:tblStylePr>
   </w:style>
-  <w:style w:type="table" w:styleId="44">
+  <w:style w:type="table" w:styleId="733">
     <w:name w:val="Grid Table 4 - Accent 4"/>
-    <w:basedOn w:val="665"/>
+    <w:basedOn w:val="887"/>
     <w:uiPriority w:val="59"/>
     <w:pPr>
       <w:pBdr/>
@@ -7973,9 +8059,9 @@
       </w:tcPr>
     </w:tblStylePr>
   </w:style>
-  <w:style w:type="table" w:styleId="45">
+  <w:style w:type="table" w:styleId="734">
     <w:name w:val="Grid Table 4 - Accent 5"/>
-    <w:basedOn w:val="665"/>
+    <w:basedOn w:val="887"/>
     <w:uiPriority w:val="59"/>
     <w:pPr>
       <w:pBdr/>
@@ -8206,9 +8292,9 @@
       </w:tcPr>
     </w:tblStylePr>
   </w:style>
-  <w:style w:type="table" w:styleId="46">
+  <w:style w:type="table" w:styleId="735">
     <w:name w:val="Grid Table 4 - Accent 6"/>
-    <w:basedOn w:val="665"/>
+    <w:basedOn w:val="887"/>
     <w:uiPriority w:val="59"/>
     <w:pPr>
       <w:pBdr/>
@@ -8439,9 +8525,9 @@
       </w:tcPr>
     </w:tblStylePr>
   </w:style>
-  <w:style w:type="table" w:styleId="47">
+  <w:style w:type="table" w:styleId="736">
     <w:name w:val="Grid Table 5 Dark"/>
-    <w:basedOn w:val="665"/>
+    <w:basedOn w:val="887"/>
     <w:uiPriority w:val="99"/>
     <w:pPr>
       <w:pBdr/>
@@ -8667,9 +8753,9 @@
       </w:tcPr>
     </w:tblStylePr>
   </w:style>
-  <w:style w:type="table" w:styleId="48">
+  <w:style w:type="table" w:styleId="737">
     <w:name w:val="Grid Table 5 Dark- Accent 1"/>
-    <w:basedOn w:val="665"/>
+    <w:basedOn w:val="887"/>
     <w:uiPriority w:val="99"/>
     <w:pPr>
       <w:pBdr/>
@@ -8895,9 +8981,9 @@
       </w:tcPr>
     </w:tblStylePr>
   </w:style>
-  <w:style w:type="table" w:styleId="49">
+  <w:style w:type="table" w:styleId="738">
     <w:name w:val="Grid Table 5 Dark - Accent 2"/>
-    <w:basedOn w:val="665"/>
+    <w:basedOn w:val="887"/>
     <w:uiPriority w:val="99"/>
     <w:pPr>
       <w:pBdr/>
@@ -9123,9 +9209,9 @@
       </w:tcPr>
     </w:tblStylePr>
   </w:style>
-  <w:style w:type="table" w:styleId="50">
+  <w:style w:type="table" w:styleId="739">
     <w:name w:val="Grid Table 5 Dark - Accent 3"/>
-    <w:basedOn w:val="665"/>
+    <w:basedOn w:val="887"/>
     <w:uiPriority w:val="99"/>
     <w:pPr>
       <w:pBdr/>
@@ -9351,9 +9437,9 @@
       </w:tcPr>
     </w:tblStylePr>
   </w:style>
-  <w:style w:type="table" w:styleId="51">
+  <w:style w:type="table" w:styleId="740">
     <w:name w:val="Grid Table 5 Dark- Accent 4"/>
-    <w:basedOn w:val="665"/>
+    <w:basedOn w:val="887"/>
     <w:uiPriority w:val="99"/>
     <w:pPr>
       <w:pBdr/>
@@ -9579,9 +9665,9 @@
       </w:tcPr>
     </w:tblStylePr>
   </w:style>
-  <w:style w:type="table" w:styleId="52">
+  <w:style w:type="table" w:styleId="741">
     <w:name w:val="Grid Table 5 Dark - Accent 5"/>
-    <w:basedOn w:val="665"/>
+    <w:basedOn w:val="887"/>
     <w:uiPriority w:val="99"/>
     <w:pPr>
       <w:pBdr/>
@@ -9807,9 +9893,9 @@
       </w:tcPr>
     </w:tblStylePr>
   </w:style>
-  <w:style w:type="table" w:styleId="53">
+  <w:style w:type="table" w:styleId="742">
     <w:name w:val="Grid Table 5 Dark - Accent 6"/>
-    <w:basedOn w:val="665"/>
+    <w:basedOn w:val="887"/>
     <w:uiPriority w:val="99"/>
     <w:pPr>
       <w:pBdr/>
@@ -10035,9 +10121,9 @@
       </w:tcPr>
     </w:tblStylePr>
   </w:style>
-  <w:style w:type="table" w:styleId="54">
+  <w:style w:type="table" w:styleId="743">
     <w:name w:val="Grid Table 6 Colorful"/>
-    <w:basedOn w:val="665"/>
+    <w:basedOn w:val="887"/>
     <w:uiPriority w:val="99"/>
     <w:pPr>
       <w:pBdr/>
@@ -10265,9 +10351,9 @@
       </w:tcPr>
     </w:tblStylePr>
   </w:style>
-  <w:style w:type="table" w:styleId="55">
+  <w:style w:type="table" w:styleId="744">
     <w:name w:val="Grid Table 6 Colorful - Accent 1"/>
-    <w:basedOn w:val="665"/>
+    <w:basedOn w:val="887"/>
     <w:uiPriority w:val="99"/>
     <w:pPr>
       <w:pBdr/>
@@ -10495,9 +10581,9 @@
       </w:tcPr>
     </w:tblStylePr>
   </w:style>
-  <w:style w:type="table" w:styleId="56">
+  <w:style w:type="table" w:styleId="745">
     <w:name w:val="Grid Table 6 Colorful - Accent 2"/>
-    <w:basedOn w:val="665"/>
+    <w:basedOn w:val="887"/>
     <w:uiPriority w:val="99"/>
     <w:pPr>
       <w:pBdr/>
@@ -10725,9 +10811,9 @@
       </w:tcPr>
     </w:tblStylePr>
   </w:style>
-  <w:style w:type="table" w:styleId="57">
+  <w:style w:type="table" w:styleId="746">
     <w:name w:val="Grid Table 6 Colorful - Accent 3"/>
-    <w:basedOn w:val="665"/>
+    <w:basedOn w:val="887"/>
     <w:uiPriority w:val="99"/>
     <w:pPr>
       <w:pBdr/>
@@ -10955,9 +11041,9 @@
       </w:tcPr>
     </w:tblStylePr>
   </w:style>
-  <w:style w:type="table" w:styleId="58">
+  <w:style w:type="table" w:styleId="747">
     <w:name w:val="Grid Table 6 Colorful - Accent 4"/>
-    <w:basedOn w:val="665"/>
+    <w:basedOn w:val="887"/>
     <w:uiPriority w:val="99"/>
     <w:pPr>
       <w:pBdr/>
@@ -11185,9 +11271,9 @@
       </w:tcPr>
     </w:tblStylePr>
   </w:style>
-  <w:style w:type="table" w:styleId="59">
+  <w:style w:type="table" w:styleId="748">
     <w:name w:val="Grid Table 6 Colorful - Accent 5"/>
-    <w:basedOn w:val="665"/>
+    <w:basedOn w:val="887"/>
     <w:uiPriority w:val="99"/>
     <w:pPr>
       <w:pBdr/>
@@ -11415,9 +11501,9 @@
       </w:tcPr>
     </w:tblStylePr>
   </w:style>
-  <w:style w:type="table" w:styleId="60">
+  <w:style w:type="table" w:styleId="749">
     <w:name w:val="Grid Table 6 Colorful - Accent 6"/>
-    <w:basedOn w:val="665"/>
+    <w:basedOn w:val="887"/>
     <w:uiPriority w:val="99"/>
     <w:pPr>
       <w:pBdr/>
@@ -11645,9 +11731,9 @@
       </w:tcPr>
     </w:tblStylePr>
   </w:style>
-  <w:style w:type="table" w:styleId="61">
+  <w:style w:type="table" w:styleId="750">
     <w:name w:val="Grid Table 7 Colorful"/>
-    <w:basedOn w:val="665"/>
+    <w:basedOn w:val="887"/>
     <w:uiPriority w:val="99"/>
     <w:pPr>
       <w:pBdr/>
@@ -11749,11 +11835,11 @@
         <w:tblBorders/>
       </w:tblPr>
       <w:tcPr>
-        <w:shd w:color="ffffff"/>
+        <w:shd w:val="clear" w:color="ffffff"/>
         <w:tcBorders>
-          <w:top w:val="none"/>
-          <w:left w:val="none"/>
-          <w:bottom w:val="none"/>
+          <w:top w:val="none" w:color="000000" w:sz="4" w:space="0"/>
+          <w:left w:val="none" w:color="000000" w:sz="4" w:space="0"/>
+          <w:bottom w:val="none" w:color="000000" w:sz="4" w:space="0"/>
           <w:right w:val="single" w:color="000000" w:themeColor="text1" w:themeTint="80" w:sz="4" w:space="0"/>
         </w:tcBorders>
       </w:tcPr>
@@ -11776,10 +11862,10 @@
       <w:tcPr>
         <w:shd w:val="clear" w:color="ffffff" w:themeColor="light1" w:fill="ffffff" w:themeFill="light1"/>
         <w:tcBorders>
-          <w:top w:val="none"/>
-          <w:left w:val="none"/>
+          <w:top w:val="none" w:color="000000" w:sz="4" w:space="0"/>
+          <w:left w:val="none" w:color="000000" w:sz="4" w:space="0"/>
           <w:bottom w:val="single" w:color="000000" w:themeColor="text1" w:themeTint="80" w:sz="4" w:space="0"/>
-          <w:right w:val="none"/>
+          <w:right w:val="none" w:color="000000" w:sz="4" w:space="0"/>
         </w:tcBorders>
       </w:tcPr>
     </w:tblStylePr>
@@ -11799,12 +11885,12 @@
         <w:tblBorders/>
       </w:tblPr>
       <w:tcPr>
-        <w:shd w:color="ffffff"/>
+        <w:shd w:val="clear" w:color="ffffff"/>
         <w:tcBorders>
-          <w:top w:val="none"/>
+          <w:top w:val="none" w:color="000000" w:sz="4" w:space="0"/>
           <w:left w:val="single" w:color="000000" w:themeColor="text1" w:themeTint="80" w:sz="4" w:space="0"/>
-          <w:bottom w:val="none"/>
-          <w:right w:val="none"/>
+          <w:bottom w:val="none" w:color="000000" w:sz="4" w:space="0"/>
+          <w:right w:val="none" w:color="000000" w:sz="4" w:space="0"/>
         </w:tcBorders>
       </w:tcPr>
     </w:tblStylePr>
@@ -11827,9 +11913,9 @@
         <w:shd w:val="clear" w:color="ffffff" w:themeColor="light1" w:fill="ffffff" w:themeFill="light1"/>
         <w:tcBorders>
           <w:top w:val="single" w:color="000000" w:themeColor="text1" w:themeTint="80" w:sz="4" w:space="0"/>
-          <w:left w:val="none"/>
-          <w:bottom w:val="none"/>
-          <w:right w:val="none"/>
+          <w:left w:val="none" w:color="000000" w:sz="4" w:space="0"/>
+          <w:bottom w:val="none" w:color="000000" w:sz="4" w:space="0"/>
+          <w:right w:val="none" w:color="000000" w:sz="4" w:space="0"/>
         </w:tcBorders>
       </w:tcPr>
     </w:tblStylePr>
@@ -11899,9 +11985,9 @@
       </w:tcPr>
     </w:tblStylePr>
   </w:style>
-  <w:style w:type="table" w:styleId="62">
+  <w:style w:type="table" w:styleId="751">
     <w:name w:val="Grid Table 7 Colorful - Accent 1"/>
-    <w:basedOn w:val="665"/>
+    <w:basedOn w:val="887"/>
     <w:uiPriority w:val="99"/>
     <w:pPr>
       <w:pBdr/>
@@ -12003,11 +12089,11 @@
         <w:tblBorders/>
       </w:tblPr>
       <w:tcPr>
-        <w:shd w:color="ffffff"/>
+        <w:shd w:val="clear" w:color="ffffff"/>
         <w:tcBorders>
-          <w:top w:val="none"/>
-          <w:left w:val="none"/>
-          <w:bottom w:val="none"/>
+          <w:top w:val="none" w:color="000000" w:sz="4" w:space="0"/>
+          <w:left w:val="none" w:color="000000" w:sz="4" w:space="0"/>
+          <w:bottom w:val="none" w:color="000000" w:sz="4" w:space="0"/>
           <w:right w:val="single" w:color="000000" w:themeColor="accent1" w:themeTint="80" w:sz="4" w:space="0"/>
         </w:tcBorders>
       </w:tcPr>
@@ -12030,10 +12116,10 @@
       <w:tcPr>
         <w:shd w:val="clear" w:color="ffffff" w:themeColor="light1" w:fill="ffffff" w:themeFill="light1"/>
         <w:tcBorders>
-          <w:top w:val="none"/>
-          <w:left w:val="none"/>
+          <w:top w:val="none" w:color="000000" w:sz="4" w:space="0"/>
+          <w:left w:val="none" w:color="000000" w:sz="4" w:space="0"/>
           <w:bottom w:val="single" w:color="000000" w:themeColor="accent1" w:themeTint="80" w:sz="4" w:space="0"/>
-          <w:right w:val="none"/>
+          <w:right w:val="none" w:color="000000" w:sz="4" w:space="0"/>
         </w:tcBorders>
       </w:tcPr>
     </w:tblStylePr>
@@ -12053,12 +12139,12 @@
         <w:tblBorders/>
       </w:tblPr>
       <w:tcPr>
-        <w:shd w:color="ffffff"/>
+        <w:shd w:val="clear" w:color="ffffff"/>
         <w:tcBorders>
-          <w:top w:val="none"/>
+          <w:top w:val="none" w:color="000000" w:sz="4" w:space="0"/>
           <w:left w:val="single" w:color="000000" w:themeColor="accent1" w:themeTint="80" w:sz="4" w:space="0"/>
-          <w:bottom w:val="none"/>
-          <w:right w:val="none"/>
+          <w:bottom w:val="none" w:color="000000" w:sz="4" w:space="0"/>
+          <w:right w:val="none" w:color="000000" w:sz="4" w:space="0"/>
         </w:tcBorders>
       </w:tcPr>
     </w:tblStylePr>
@@ -12081,9 +12167,9 @@
         <w:shd w:val="clear" w:color="ffffff" w:themeColor="light1" w:fill="ffffff" w:themeFill="light1"/>
         <w:tcBorders>
           <w:top w:val="single" w:color="000000" w:themeColor="accent1" w:themeTint="80" w:sz="4" w:space="0"/>
-          <w:left w:val="none"/>
-          <w:bottom w:val="none"/>
-          <w:right w:val="none"/>
+          <w:left w:val="none" w:color="000000" w:sz="4" w:space="0"/>
+          <w:bottom w:val="none" w:color="000000" w:sz="4" w:space="0"/>
+          <w:right w:val="none" w:color="000000" w:sz="4" w:space="0"/>
         </w:tcBorders>
       </w:tcPr>
     </w:tblStylePr>
@@ -12153,9 +12239,9 @@
       </w:tcPr>
     </w:tblStylePr>
   </w:style>
-  <w:style w:type="table" w:styleId="63">
+  <w:style w:type="table" w:styleId="752">
     <w:name w:val="Grid Table 7 Colorful - Accent 2"/>
-    <w:basedOn w:val="665"/>
+    <w:basedOn w:val="887"/>
     <w:uiPriority w:val="99"/>
     <w:pPr>
       <w:pBdr/>
@@ -12257,11 +12343,11 @@
         <w:tblBorders/>
       </w:tblPr>
       <w:tcPr>
-        <w:shd w:color="ffffff"/>
+        <w:shd w:val="clear" w:color="ffffff"/>
         <w:tcBorders>
-          <w:top w:val="none"/>
-          <w:left w:val="none"/>
-          <w:bottom w:val="none"/>
+          <w:top w:val="none" w:color="000000" w:sz="4" w:space="0"/>
+          <w:left w:val="none" w:color="000000" w:sz="4" w:space="0"/>
+          <w:bottom w:val="none" w:color="000000" w:sz="4" w:space="0"/>
           <w:right w:val="single" w:color="000000" w:themeColor="accent2" w:themeTint="97" w:sz="4" w:space="0"/>
         </w:tcBorders>
       </w:tcPr>
@@ -12284,10 +12370,10 @@
       <w:tcPr>
         <w:shd w:val="clear" w:color="ffffff" w:themeColor="light1" w:fill="ffffff" w:themeFill="light1"/>
         <w:tcBorders>
-          <w:top w:val="none"/>
-          <w:left w:val="none"/>
+          <w:top w:val="none" w:color="000000" w:sz="4" w:space="0"/>
+          <w:left w:val="none" w:color="000000" w:sz="4" w:space="0"/>
           <w:bottom w:val="single" w:color="000000" w:themeColor="accent2" w:themeTint="97" w:sz="4" w:space="0"/>
-          <w:right w:val="none"/>
+          <w:right w:val="none" w:color="000000" w:sz="4" w:space="0"/>
         </w:tcBorders>
       </w:tcPr>
     </w:tblStylePr>
@@ -12307,12 +12393,12 @@
         <w:tblBorders/>
       </w:tblPr>
       <w:tcPr>
-        <w:shd w:color="ffffff"/>
+        <w:shd w:val="clear" w:color="ffffff"/>
         <w:tcBorders>
-          <w:top w:val="none"/>
+          <w:top w:val="none" w:color="000000" w:sz="4" w:space="0"/>
           <w:left w:val="single" w:color="000000" w:themeColor="accent2" w:themeTint="97" w:sz="4" w:space="0"/>
-          <w:bottom w:val="none"/>
-          <w:right w:val="none"/>
+          <w:bottom w:val="none" w:color="000000" w:sz="4" w:space="0"/>
+          <w:right w:val="none" w:color="000000" w:sz="4" w:space="0"/>
         </w:tcBorders>
       </w:tcPr>
     </w:tblStylePr>
@@ -12335,9 +12421,9 @@
         <w:shd w:val="clear" w:color="ffffff" w:themeColor="light1" w:fill="ffffff" w:themeFill="light1"/>
         <w:tcBorders>
           <w:top w:val="single" w:color="000000" w:themeColor="accent2" w:themeTint="97" w:sz="4" w:space="0"/>
-          <w:left w:val="none"/>
-          <w:bottom w:val="none"/>
-          <w:right w:val="none"/>
+          <w:left w:val="none" w:color="000000" w:sz="4" w:space="0"/>
+          <w:bottom w:val="none" w:color="000000" w:sz="4" w:space="0"/>
+          <w:right w:val="none" w:color="000000" w:sz="4" w:space="0"/>
         </w:tcBorders>
       </w:tcPr>
     </w:tblStylePr>
@@ -12407,9 +12493,9 @@
       </w:tcPr>
     </w:tblStylePr>
   </w:style>
-  <w:style w:type="table" w:styleId="64">
+  <w:style w:type="table" w:styleId="753">
     <w:name w:val="Grid Table 7 Colorful - Accent 3"/>
-    <w:basedOn w:val="665"/>
+    <w:basedOn w:val="887"/>
     <w:uiPriority w:val="99"/>
     <w:pPr>
       <w:pBdr/>
@@ -12511,11 +12597,11 @@
         <w:tblBorders/>
       </w:tblPr>
       <w:tcPr>
-        <w:shd w:color="ffffff"/>
+        <w:shd w:val="clear" w:color="ffffff"/>
         <w:tcBorders>
-          <w:top w:val="none"/>
-          <w:left w:val="none"/>
-          <w:bottom w:val="none"/>
+          <w:top w:val="none" w:color="000000" w:sz="4" w:space="0"/>
+          <w:left w:val="none" w:color="000000" w:sz="4" w:space="0"/>
+          <w:bottom w:val="none" w:color="000000" w:sz="4" w:space="0"/>
           <w:right w:val="single" w:color="000000" w:themeColor="accent3" w:themeTint="FE" w:sz="4" w:space="0"/>
         </w:tcBorders>
       </w:tcPr>
@@ -12538,10 +12624,10 @@
       <w:tcPr>
         <w:shd w:val="clear" w:color="ffffff" w:themeColor="light1" w:fill="ffffff" w:themeFill="light1"/>
         <w:tcBorders>
-          <w:top w:val="none"/>
-          <w:left w:val="none"/>
+          <w:top w:val="none" w:color="000000" w:sz="4" w:space="0"/>
+          <w:left w:val="none" w:color="000000" w:sz="4" w:space="0"/>
           <w:bottom w:val="single" w:color="000000" w:themeColor="accent3" w:themeTint="FE" w:sz="4" w:space="0"/>
-          <w:right w:val="none"/>
+          <w:right w:val="none" w:color="000000" w:sz="4" w:space="0"/>
         </w:tcBorders>
       </w:tcPr>
     </w:tblStylePr>
@@ -12561,12 +12647,12 @@
         <w:tblBorders/>
       </w:tblPr>
       <w:tcPr>
-        <w:shd w:color="ffffff"/>
+        <w:shd w:val="clear" w:color="ffffff"/>
         <w:tcBorders>
-          <w:top w:val="none"/>
+          <w:top w:val="none" w:color="000000" w:sz="4" w:space="0"/>
           <w:left w:val="single" w:color="000000" w:themeColor="accent3" w:themeTint="FE" w:sz="4" w:space="0"/>
-          <w:bottom w:val="none"/>
-          <w:right w:val="none"/>
+          <w:bottom w:val="none" w:color="000000" w:sz="4" w:space="0"/>
+          <w:right w:val="none" w:color="000000" w:sz="4" w:space="0"/>
         </w:tcBorders>
       </w:tcPr>
     </w:tblStylePr>
@@ -12589,9 +12675,9 @@
         <w:shd w:val="clear" w:color="ffffff" w:themeColor="light1" w:fill="ffffff" w:themeFill="light1"/>
         <w:tcBorders>
           <w:top w:val="single" w:color="000000" w:themeColor="accent3" w:themeTint="FE" w:sz="4" w:space="0"/>
-          <w:left w:val="none"/>
-          <w:bottom w:val="none"/>
-          <w:right w:val="none"/>
+          <w:left w:val="none" w:color="000000" w:sz="4" w:space="0"/>
+          <w:bottom w:val="none" w:color="000000" w:sz="4" w:space="0"/>
+          <w:right w:val="none" w:color="000000" w:sz="4" w:space="0"/>
         </w:tcBorders>
       </w:tcPr>
     </w:tblStylePr>
@@ -12661,9 +12747,9 @@
       </w:tcPr>
     </w:tblStylePr>
   </w:style>
-  <w:style w:type="table" w:styleId="65">
+  <w:style w:type="table" w:styleId="754">
     <w:name w:val="Grid Table 7 Colorful - Accent 4"/>
-    <w:basedOn w:val="665"/>
+    <w:basedOn w:val="887"/>
     <w:uiPriority w:val="99"/>
     <w:pPr>
       <w:pBdr/>
@@ -12765,11 +12851,11 @@
         <w:tblBorders/>
       </w:tblPr>
       <w:tcPr>
-        <w:shd w:color="ffffff"/>
+        <w:shd w:val="clear" w:color="ffffff"/>
         <w:tcBorders>
-          <w:top w:val="none"/>
-          <w:left w:val="none"/>
-          <w:bottom w:val="none"/>
+          <w:top w:val="none" w:color="000000" w:sz="4" w:space="0"/>
+          <w:left w:val="none" w:color="000000" w:sz="4" w:space="0"/>
+          <w:bottom w:val="none" w:color="000000" w:sz="4" w:space="0"/>
           <w:right w:val="single" w:color="000000" w:themeColor="accent4" w:themeTint="9A" w:sz="4" w:space="0"/>
         </w:tcBorders>
       </w:tcPr>
@@ -12792,10 +12878,10 @@
       <w:tcPr>
         <w:shd w:val="clear" w:color="ffffff" w:themeColor="light1" w:fill="ffffff" w:themeFill="light1"/>
         <w:tcBorders>
-          <w:top w:val="none"/>
-          <w:left w:val="none"/>
+          <w:top w:val="none" w:color="000000" w:sz="4" w:space="0"/>
+          <w:left w:val="none" w:color="000000" w:sz="4" w:space="0"/>
           <w:bottom w:val="single" w:color="000000" w:themeColor="accent4" w:themeTint="9A" w:sz="4" w:space="0"/>
-          <w:right w:val="none"/>
+          <w:right w:val="none" w:color="000000" w:sz="4" w:space="0"/>
         </w:tcBorders>
       </w:tcPr>
     </w:tblStylePr>
@@ -12815,12 +12901,12 @@
         <w:tblBorders/>
       </w:tblPr>
       <w:tcPr>
-        <w:shd w:color="ffffff"/>
+        <w:shd w:val="clear" w:color="ffffff"/>
         <w:tcBorders>
-          <w:top w:val="none"/>
+          <w:top w:val="none" w:color="000000" w:sz="4" w:space="0"/>
           <w:left w:val="single" w:color="000000" w:themeColor="accent4" w:themeTint="9A" w:sz="4" w:space="0"/>
-          <w:bottom w:val="none"/>
-          <w:right w:val="none"/>
+          <w:bottom w:val="none" w:color="000000" w:sz="4" w:space="0"/>
+          <w:right w:val="none" w:color="000000" w:sz="4" w:space="0"/>
         </w:tcBorders>
       </w:tcPr>
     </w:tblStylePr>
@@ -12843,9 +12929,9 @@
         <w:shd w:val="clear" w:color="ffffff" w:themeColor="light1" w:fill="ffffff" w:themeFill="light1"/>
         <w:tcBorders>
           <w:top w:val="single" w:color="000000" w:themeColor="accent4" w:themeTint="9A" w:sz="4" w:space="0"/>
-          <w:left w:val="none"/>
-          <w:bottom w:val="none"/>
-          <w:right w:val="none"/>
+          <w:left w:val="none" w:color="000000" w:sz="4" w:space="0"/>
+          <w:bottom w:val="none" w:color="000000" w:sz="4" w:space="0"/>
+          <w:right w:val="none" w:color="000000" w:sz="4" w:space="0"/>
         </w:tcBorders>
       </w:tcPr>
     </w:tblStylePr>
@@ -12915,9 +13001,9 @@
       </w:tcPr>
     </w:tblStylePr>
   </w:style>
-  <w:style w:type="table" w:styleId="66">
+  <w:style w:type="table" w:styleId="755">
     <w:name w:val="Grid Table 7 Colorful - Accent 5"/>
-    <w:basedOn w:val="665"/>
+    <w:basedOn w:val="887"/>
     <w:uiPriority w:val="99"/>
     <w:pPr>
       <w:pBdr/>
@@ -13019,11 +13105,11 @@
         <w:tblBorders/>
       </w:tblPr>
       <w:tcPr>
-        <w:shd w:color="ffffff"/>
+        <w:shd w:val="clear" w:color="ffffff"/>
         <w:tcBorders>
-          <w:top w:val="none"/>
-          <w:left w:val="none"/>
-          <w:bottom w:val="none"/>
+          <w:top w:val="none" w:color="000000" w:sz="4" w:space="0"/>
+          <w:left w:val="none" w:color="000000" w:sz="4" w:space="0"/>
+          <w:bottom w:val="none" w:color="000000" w:sz="4" w:space="0"/>
           <w:right w:val="single" w:color="000000" w:themeColor="accent5" w:themeTint="90" w:sz="4" w:space="0"/>
         </w:tcBorders>
       </w:tcPr>
@@ -13046,10 +13132,10 @@
       <w:tcPr>
         <w:shd w:val="clear" w:color="ffffff" w:themeColor="light1" w:fill="ffffff" w:themeFill="light1"/>
         <w:tcBorders>
-          <w:top w:val="none"/>
-          <w:left w:val="none"/>
+          <w:top w:val="none" w:color="000000" w:sz="4" w:space="0"/>
+          <w:left w:val="none" w:color="000000" w:sz="4" w:space="0"/>
           <w:bottom w:val="single" w:color="000000" w:themeColor="accent5" w:themeTint="90" w:sz="4" w:space="0"/>
-          <w:right w:val="none"/>
+          <w:right w:val="none" w:color="000000" w:sz="4" w:space="0"/>
         </w:tcBorders>
       </w:tcPr>
     </w:tblStylePr>
@@ -13069,12 +13155,12 @@
         <w:tblBorders/>
       </w:tblPr>
       <w:tcPr>
-        <w:shd w:color="ffffff"/>
+        <w:shd w:val="clear" w:color="ffffff"/>
         <w:tcBorders>
-          <w:top w:val="none"/>
+          <w:top w:val="none" w:color="000000" w:sz="4" w:space="0"/>
           <w:left w:val="single" w:color="000000" w:themeColor="accent5" w:themeTint="90" w:sz="4" w:space="0"/>
-          <w:bottom w:val="none"/>
-          <w:right w:val="none"/>
+          <w:bottom w:val="none" w:color="000000" w:sz="4" w:space="0"/>
+          <w:right w:val="none" w:color="000000" w:sz="4" w:space="0"/>
         </w:tcBorders>
       </w:tcPr>
     </w:tblStylePr>
@@ -13097,9 +13183,9 @@
         <w:shd w:val="clear" w:color="ffffff" w:themeColor="light1" w:fill="ffffff" w:themeFill="light1"/>
         <w:tcBorders>
           <w:top w:val="single" w:color="000000" w:themeColor="accent5" w:themeTint="90" w:sz="4" w:space="0"/>
-          <w:left w:val="none"/>
-          <w:bottom w:val="none"/>
-          <w:right w:val="none"/>
+          <w:left w:val="none" w:color="000000" w:sz="4" w:space="0"/>
+          <w:bottom w:val="none" w:color="000000" w:sz="4" w:space="0"/>
+          <w:right w:val="none" w:color="000000" w:sz="4" w:space="0"/>
         </w:tcBorders>
       </w:tcPr>
     </w:tblStylePr>
@@ -13169,9 +13255,9 @@
       </w:tcPr>
     </w:tblStylePr>
   </w:style>
-  <w:style w:type="table" w:styleId="67">
+  <w:style w:type="table" w:styleId="756">
     <w:name w:val="Grid Table 7 Colorful - Accent 6"/>
-    <w:basedOn w:val="665"/>
+    <w:basedOn w:val="887"/>
     <w:uiPriority w:val="99"/>
     <w:pPr>
       <w:pBdr/>
@@ -13273,11 +13359,11 @@
         <w:tblBorders/>
       </w:tblPr>
       <w:tcPr>
-        <w:shd w:color="ffffff"/>
+        <w:shd w:val="clear" w:color="ffffff"/>
         <w:tcBorders>
-          <w:top w:val="none"/>
-          <w:left w:val="none"/>
-          <w:bottom w:val="none"/>
+          <w:top w:val="none" w:color="000000" w:sz="4" w:space="0"/>
+          <w:left w:val="none" w:color="000000" w:sz="4" w:space="0"/>
+          <w:bottom w:val="none" w:color="000000" w:sz="4" w:space="0"/>
           <w:right w:val="single" w:color="000000" w:themeColor="accent6" w:themeTint="90" w:sz="4" w:space="0"/>
         </w:tcBorders>
       </w:tcPr>
@@ -13300,10 +13386,10 @@
       <w:tcPr>
         <w:shd w:val="clear" w:color="ffffff" w:themeColor="light1" w:fill="ffffff" w:themeFill="light1"/>
         <w:tcBorders>
-          <w:top w:val="none"/>
-          <w:left w:val="none"/>
+          <w:top w:val="none" w:color="000000" w:sz="4" w:space="0"/>
+          <w:left w:val="none" w:color="000000" w:sz="4" w:space="0"/>
           <w:bottom w:val="single" w:color="000000" w:themeColor="accent6" w:themeTint="90" w:sz="4" w:space="0"/>
-          <w:right w:val="none"/>
+          <w:right w:val="none" w:color="000000" w:sz="4" w:space="0"/>
         </w:tcBorders>
       </w:tcPr>
     </w:tblStylePr>
@@ -13323,12 +13409,12 @@
         <w:tblBorders/>
       </w:tblPr>
       <w:tcPr>
-        <w:shd w:color="ffffff"/>
+        <w:shd w:val="clear" w:color="ffffff"/>
         <w:tcBorders>
-          <w:top w:val="none"/>
+          <w:top w:val="none" w:color="000000" w:sz="4" w:space="0"/>
           <w:left w:val="single" w:color="000000" w:themeColor="accent6" w:themeTint="90" w:sz="4" w:space="0"/>
-          <w:bottom w:val="none"/>
-          <w:right w:val="none"/>
+          <w:bottom w:val="none" w:color="000000" w:sz="4" w:space="0"/>
+          <w:right w:val="none" w:color="000000" w:sz="4" w:space="0"/>
         </w:tcBorders>
       </w:tcPr>
     </w:tblStylePr>
@@ -13351,9 +13437,9 @@
         <w:shd w:val="clear" w:color="ffffff" w:themeColor="light1" w:fill="ffffff" w:themeFill="light1"/>
         <w:tcBorders>
           <w:top w:val="single" w:color="000000" w:themeColor="accent6" w:themeTint="90" w:sz="4" w:space="0"/>
-          <w:left w:val="none"/>
-          <w:bottom w:val="none"/>
-          <w:right w:val="none"/>
+          <w:left w:val="none" w:color="000000" w:sz="4" w:space="0"/>
+          <w:bottom w:val="none" w:color="000000" w:sz="4" w:space="0"/>
+          <w:right w:val="none" w:color="000000" w:sz="4" w:space="0"/>
         </w:tcBorders>
       </w:tcPr>
     </w:tblStylePr>
@@ -13423,9 +13509,9 @@
       </w:tcPr>
     </w:tblStylePr>
   </w:style>
-  <w:style w:type="table" w:styleId="68">
+  <w:style w:type="table" w:styleId="757">
     <w:name w:val="List Table 1 Light"/>
-    <w:basedOn w:val="665"/>
+    <w:basedOn w:val="887"/>
     <w:uiPriority w:val="99"/>
     <w:pPr>
       <w:pBdr/>
@@ -13639,9 +13725,9 @@
       </w:tcPr>
     </w:tblStylePr>
   </w:style>
-  <w:style w:type="table" w:styleId="69">
+  <w:style w:type="table" w:styleId="758">
     <w:name w:val="List Table 1 Light - Accent 1"/>
-    <w:basedOn w:val="665"/>
+    <w:basedOn w:val="887"/>
     <w:uiPriority w:val="99"/>
     <w:pPr>
       <w:pBdr/>
@@ -13855,9 +13941,9 @@
       </w:tcPr>
     </w:tblStylePr>
   </w:style>
-  <w:style w:type="table" w:styleId="70">
+  <w:style w:type="table" w:styleId="759">
     <w:name w:val="List Table 1 Light - Accent 2"/>
-    <w:basedOn w:val="665"/>
+    <w:basedOn w:val="887"/>
     <w:uiPriority w:val="99"/>
     <w:pPr>
       <w:pBdr/>
@@ -14071,9 +14157,9 @@
       </w:tcPr>
     </w:tblStylePr>
   </w:style>
-  <w:style w:type="table" w:styleId="71">
+  <w:style w:type="table" w:styleId="760">
     <w:name w:val="List Table 1 Light - Accent 3"/>
-    <w:basedOn w:val="665"/>
+    <w:basedOn w:val="887"/>
     <w:uiPriority w:val="99"/>
     <w:pPr>
       <w:pBdr/>
@@ -14287,9 +14373,9 @@
       </w:tcPr>
     </w:tblStylePr>
   </w:style>
-  <w:style w:type="table" w:styleId="72">
+  <w:style w:type="table" w:styleId="761">
     <w:name w:val="List Table 1 Light - Accent 4"/>
-    <w:basedOn w:val="665"/>
+    <w:basedOn w:val="887"/>
     <w:uiPriority w:val="99"/>
     <w:pPr>
       <w:pBdr/>
@@ -14503,9 +14589,9 @@
       </w:tcPr>
     </w:tblStylePr>
   </w:style>
-  <w:style w:type="table" w:styleId="73">
+  <w:style w:type="table" w:styleId="762">
     <w:name w:val="List Table 1 Light - Accent 5"/>
-    <w:basedOn w:val="665"/>
+    <w:basedOn w:val="887"/>
     <w:uiPriority w:val="99"/>
     <w:pPr>
       <w:pBdr/>
@@ -14719,9 +14805,9 @@
       </w:tcPr>
     </w:tblStylePr>
   </w:style>
-  <w:style w:type="table" w:styleId="74">
+  <w:style w:type="table" w:styleId="763">
     <w:name w:val="List Table 1 Light - Accent 6"/>
-    <w:basedOn w:val="665"/>
+    <w:basedOn w:val="887"/>
     <w:uiPriority w:val="99"/>
     <w:pPr>
       <w:pBdr/>
@@ -14935,9 +15021,9 @@
       </w:tcPr>
     </w:tblStylePr>
   </w:style>
-  <w:style w:type="table" w:styleId="75">
+  <w:style w:type="table" w:styleId="764">
     <w:name w:val="List Table 2"/>
-    <w:basedOn w:val="665"/>
+    <w:basedOn w:val="887"/>
     <w:uiPriority w:val="99"/>
     <w:pPr>
       <w:pBdr/>
@@ -15173,9 +15259,9 @@
       </w:tcPr>
     </w:tblStylePr>
   </w:style>
-  <w:style w:type="table" w:styleId="76">
+  <w:style w:type="table" w:styleId="765">
     <w:name w:val="List Table 2 - Accent 1"/>
-    <w:basedOn w:val="665"/>
+    <w:basedOn w:val="887"/>
     <w:uiPriority w:val="99"/>
     <w:pPr>
       <w:pBdr/>
@@ -15411,9 +15497,9 @@
       </w:tcPr>
     </w:tblStylePr>
   </w:style>
-  <w:style w:type="table" w:styleId="77">
+  <w:style w:type="table" w:styleId="766">
     <w:name w:val="List Table 2 - Accent 2"/>
-    <w:basedOn w:val="665"/>
+    <w:basedOn w:val="887"/>
     <w:uiPriority w:val="99"/>
     <w:pPr>
       <w:pBdr/>
@@ -15649,9 +15735,9 @@
       </w:tcPr>
     </w:tblStylePr>
   </w:style>
-  <w:style w:type="table" w:styleId="78">
+  <w:style w:type="table" w:styleId="767">
     <w:name w:val="List Table 2 - Accent 3"/>
-    <w:basedOn w:val="665"/>
+    <w:basedOn w:val="887"/>
     <w:uiPriority w:val="99"/>
     <w:pPr>
       <w:pBdr/>
@@ -15887,9 +15973,9 @@
       </w:tcPr>
     </w:tblStylePr>
   </w:style>
-  <w:style w:type="table" w:styleId="79">
+  <w:style w:type="table" w:styleId="768">
     <w:name w:val="List Table 2 - Accent 4"/>
-    <w:basedOn w:val="665"/>
+    <w:basedOn w:val="887"/>
     <w:uiPriority w:val="99"/>
     <w:pPr>
       <w:pBdr/>
@@ -16125,9 +16211,9 @@
       </w:tcPr>
     </w:tblStylePr>
   </w:style>
-  <w:style w:type="table" w:styleId="80">
+  <w:style w:type="table" w:styleId="769">
     <w:name w:val="List Table 2 - Accent 5"/>
-    <w:basedOn w:val="665"/>
+    <w:basedOn w:val="887"/>
     <w:uiPriority w:val="99"/>
     <w:pPr>
       <w:pBdr/>
@@ -16363,9 +16449,9 @@
       </w:tcPr>
     </w:tblStylePr>
   </w:style>
-  <w:style w:type="table" w:styleId="81">
+  <w:style w:type="table" w:styleId="770">
     <w:name w:val="List Table 2 - Accent 6"/>
-    <w:basedOn w:val="665"/>
+    <w:basedOn w:val="887"/>
     <w:uiPriority w:val="99"/>
     <w:pPr>
       <w:pBdr/>
@@ -16601,9 +16687,9 @@
       </w:tcPr>
     </w:tblStylePr>
   </w:style>
-  <w:style w:type="table" w:styleId="82">
+  <w:style w:type="table" w:styleId="771">
     <w:name w:val="List Table 3"/>
-    <w:basedOn w:val="665"/>
+    <w:basedOn w:val="887"/>
     <w:uiPriority w:val="99"/>
     <w:pPr>
       <w:pBdr/>
@@ -16829,9 +16915,9 @@
       </w:tcPr>
     </w:tblStylePr>
   </w:style>
-  <w:style w:type="table" w:styleId="83">
+  <w:style w:type="table" w:styleId="772">
     <w:name w:val="List Table 3 - Accent 1"/>
-    <w:basedOn w:val="665"/>
+    <w:basedOn w:val="887"/>
     <w:uiPriority w:val="99"/>
     <w:pPr>
       <w:pBdr/>
@@ -17057,9 +17143,9 @@
       </w:tcPr>
     </w:tblStylePr>
   </w:style>
-  <w:style w:type="table" w:styleId="84">
+  <w:style w:type="table" w:styleId="773">
     <w:name w:val="List Table 3 - Accent 2"/>
-    <w:basedOn w:val="665"/>
+    <w:basedOn w:val="887"/>
     <w:uiPriority w:val="99"/>
     <w:pPr>
       <w:pBdr/>
@@ -17285,9 +17371,9 @@
       </w:tcPr>
     </w:tblStylePr>
   </w:style>
-  <w:style w:type="table" w:styleId="85">
+  <w:style w:type="table" w:styleId="774">
     <w:name w:val="List Table 3 - Accent 3"/>
-    <w:basedOn w:val="665"/>
+    <w:basedOn w:val="887"/>
     <w:uiPriority w:val="99"/>
     <w:pPr>
       <w:pBdr/>
@@ -17513,9 +17599,9 @@
       </w:tcPr>
     </w:tblStylePr>
   </w:style>
-  <w:style w:type="table" w:styleId="86">
+  <w:style w:type="table" w:styleId="775">
     <w:name w:val="List Table 3 - Accent 4"/>
-    <w:basedOn w:val="665"/>
+    <w:basedOn w:val="887"/>
     <w:uiPriority w:val="99"/>
     <w:pPr>
       <w:pBdr/>
@@ -17741,9 +17827,9 @@
       </w:tcPr>
     </w:tblStylePr>
   </w:style>
-  <w:style w:type="table" w:styleId="87">
+  <w:style w:type="table" w:styleId="776">
     <w:name w:val="List Table 3 - Accent 5"/>
-    <w:basedOn w:val="665"/>
+    <w:basedOn w:val="887"/>
     <w:uiPriority w:val="99"/>
     <w:pPr>
       <w:pBdr/>
@@ -17969,9 +18055,9 @@
       </w:tcPr>
     </w:tblStylePr>
   </w:style>
-  <w:style w:type="table" w:styleId="88">
+  <w:style w:type="table" w:styleId="777">
     <w:name w:val="List Table 3 - Accent 6"/>
-    <w:basedOn w:val="665"/>
+    <w:basedOn w:val="887"/>
     <w:uiPriority w:val="99"/>
     <w:pPr>
       <w:pBdr/>
@@ -18197,9 +18283,9 @@
       </w:tcPr>
     </w:tblStylePr>
   </w:style>
-  <w:style w:type="table" w:styleId="89">
+  <w:style w:type="table" w:styleId="778">
     <w:name w:val="List Table 4"/>
-    <w:basedOn w:val="665"/>
+    <w:basedOn w:val="887"/>
     <w:uiPriority w:val="99"/>
     <w:pPr>
       <w:pBdr/>
@@ -18422,9 +18508,9 @@
       </w:tcPr>
     </w:tblStylePr>
   </w:style>
-  <w:style w:type="table" w:styleId="90">
+  <w:style w:type="table" w:styleId="779">
     <w:name w:val="List Table 4 - Accent 1"/>
-    <w:basedOn w:val="665"/>
+    <w:basedOn w:val="887"/>
     <w:uiPriority w:val="99"/>
     <w:pPr>
       <w:pBdr/>
@@ -18647,9 +18733,9 @@
       </w:tcPr>
     </w:tblStylePr>
   </w:style>
-  <w:style w:type="table" w:styleId="91">
+  <w:style w:type="table" w:styleId="780">
     <w:name w:val="List Table 4 - Accent 2"/>
-    <w:basedOn w:val="665"/>
+    <w:basedOn w:val="887"/>
     <w:uiPriority w:val="99"/>
     <w:pPr>
       <w:pBdr/>
@@ -18872,9 +18958,9 @@
       </w:tcPr>
     </w:tblStylePr>
   </w:style>
-  <w:style w:type="table" w:styleId="92">
+  <w:style w:type="table" w:styleId="781">
     <w:name w:val="List Table 4 - Accent 3"/>
-    <w:basedOn w:val="665"/>
+    <w:basedOn w:val="887"/>
     <w:uiPriority w:val="99"/>
     <w:pPr>
       <w:pBdr/>
@@ -19097,9 +19183,9 @@
       </w:tcPr>
     </w:tblStylePr>
   </w:style>
-  <w:style w:type="table" w:styleId="93">
+  <w:style w:type="table" w:styleId="782">
     <w:name w:val="List Table 4 - Accent 4"/>
-    <w:basedOn w:val="665"/>
+    <w:basedOn w:val="887"/>
     <w:uiPriority w:val="99"/>
     <w:pPr>
       <w:pBdr/>
@@ -19322,9 +19408,9 @@
       </w:tcPr>
     </w:tblStylePr>
   </w:style>
-  <w:style w:type="table" w:styleId="94">
+  <w:style w:type="table" w:styleId="783">
     <w:name w:val="List Table 4 - Accent 5"/>
-    <w:basedOn w:val="665"/>
+    <w:basedOn w:val="887"/>
     <w:uiPriority w:val="99"/>
     <w:pPr>
       <w:pBdr/>
@@ -19547,9 +19633,9 @@
       </w:tcPr>
     </w:tblStylePr>
   </w:style>
-  <w:style w:type="table" w:styleId="95">
+  <w:style w:type="table" w:styleId="784">
     <w:name w:val="List Table 4 - Accent 6"/>
-    <w:basedOn w:val="665"/>
+    <w:basedOn w:val="887"/>
     <w:uiPriority w:val="99"/>
     <w:pPr>
       <w:pBdr/>
@@ -19772,9 +19858,9 @@
       </w:tcPr>
     </w:tblStylePr>
   </w:style>
-  <w:style w:type="table" w:styleId="96">
+  <w:style w:type="table" w:styleId="785">
     <w:name w:val="List Table 5 Dark"/>
-    <w:basedOn w:val="665"/>
+    <w:basedOn w:val="887"/>
     <w:uiPriority w:val="99"/>
     <w:pPr>
       <w:pBdr/>
@@ -20014,9 +20100,9 @@
       </w:tcPr>
     </w:tblStylePr>
   </w:style>
-  <w:style w:type="table" w:styleId="97">
+  <w:style w:type="table" w:styleId="786">
     <w:name w:val="List Table 5 Dark - Accent 1"/>
-    <w:basedOn w:val="665"/>
+    <w:basedOn w:val="887"/>
     <w:uiPriority w:val="99"/>
     <w:pPr>
       <w:pBdr/>
@@ -20256,9 +20342,9 @@
       </w:tcPr>
     </w:tblStylePr>
   </w:style>
-  <w:style w:type="table" w:styleId="98">
+  <w:style w:type="table" w:styleId="787">
     <w:name w:val="List Table 5 Dark - Accent 2"/>
-    <w:basedOn w:val="665"/>
+    <w:basedOn w:val="887"/>
     <w:uiPriority w:val="99"/>
     <w:pPr>
       <w:pBdr/>
@@ -20498,9 +20584,9 @@
       </w:tcPr>
     </w:tblStylePr>
   </w:style>
-  <w:style w:type="table" w:styleId="99">
+  <w:style w:type="table" w:styleId="788">
     <w:name w:val="List Table 5 Dark - Accent 3"/>
-    <w:basedOn w:val="665"/>
+    <w:basedOn w:val="887"/>
     <w:uiPriority w:val="99"/>
     <w:pPr>
       <w:pBdr/>
@@ -20740,9 +20826,9 @@
       </w:tcPr>
     </w:tblStylePr>
   </w:style>
-  <w:style w:type="table" w:styleId="100">
+  <w:style w:type="table" w:styleId="789">
     <w:name w:val="List Table 5 Dark - Accent 4"/>
-    <w:basedOn w:val="665"/>
+    <w:basedOn w:val="887"/>
     <w:uiPriority w:val="99"/>
     <w:pPr>
       <w:pBdr/>
@@ -20982,9 +21068,9 @@
       </w:tcPr>
     </w:tblStylePr>
   </w:style>
-  <w:style w:type="table" w:styleId="101">
+  <w:style w:type="table" w:styleId="790">
     <w:name w:val="List Table 5 Dark - Accent 5"/>
-    <w:basedOn w:val="665"/>
+    <w:basedOn w:val="887"/>
     <w:uiPriority w:val="99"/>
     <w:pPr>
       <w:pBdr/>
@@ -21224,9 +21310,9 @@
       </w:tcPr>
     </w:tblStylePr>
   </w:style>
-  <w:style w:type="table" w:styleId="102">
+  <w:style w:type="table" w:styleId="791">
     <w:name w:val="List Table 5 Dark - Accent 6"/>
-    <w:basedOn w:val="665"/>
+    <w:basedOn w:val="887"/>
     <w:uiPriority w:val="99"/>
     <w:pPr>
       <w:pBdr/>
@@ -21466,9 +21552,9 @@
       </w:tcPr>
     </w:tblStylePr>
   </w:style>
-  <w:style w:type="table" w:styleId="103">
+  <w:style w:type="table" w:styleId="792">
     <w:name w:val="List Table 6 Colorful"/>
-    <w:basedOn w:val="665"/>
+    <w:basedOn w:val="887"/>
     <w:uiPriority w:val="99"/>
     <w:pPr>
       <w:pBdr/>
@@ -21689,9 +21775,9 @@
       </w:tcPr>
     </w:tblStylePr>
   </w:style>
-  <w:style w:type="table" w:styleId="104">
+  <w:style w:type="table" w:styleId="793">
     <w:name w:val="List Table 6 Colorful - Accent 1"/>
-    <w:basedOn w:val="665"/>
+    <w:basedOn w:val="887"/>
     <w:uiPriority w:val="99"/>
     <w:pPr>
       <w:pBdr/>
@@ -21912,9 +21998,9 @@
       </w:tcPr>
     </w:tblStylePr>
   </w:style>
-  <w:style w:type="table" w:styleId="105">
+  <w:style w:type="table" w:styleId="794">
     <w:name w:val="List Table 6 Colorful - Accent 2"/>
-    <w:basedOn w:val="665"/>
+    <w:basedOn w:val="887"/>
     <w:uiPriority w:val="99"/>
     <w:pPr>
       <w:pBdr/>
@@ -22135,9 +22221,9 @@
       </w:tcPr>
     </w:tblStylePr>
   </w:style>
-  <w:style w:type="table" w:styleId="106">
+  <w:style w:type="table" w:styleId="795">
     <w:name w:val="List Table 6 Colorful - Accent 3"/>
-    <w:basedOn w:val="665"/>
+    <w:basedOn w:val="887"/>
     <w:uiPriority w:val="99"/>
     <w:pPr>
       <w:pBdr/>
@@ -22358,9 +22444,9 @@
       </w:tcPr>
     </w:tblStylePr>
   </w:style>
-  <w:style w:type="table" w:styleId="107">
+  <w:style w:type="table" w:styleId="796">
     <w:name w:val="List Table 6 Colorful - Accent 4"/>
-    <w:basedOn w:val="665"/>
+    <w:basedOn w:val="887"/>
     <w:uiPriority w:val="99"/>
     <w:pPr>
       <w:pBdr/>
@@ -22581,9 +22667,9 @@
       </w:tcPr>
     </w:tblStylePr>
   </w:style>
-  <w:style w:type="table" w:styleId="108">
+  <w:style w:type="table" w:styleId="797">
     <w:name w:val="List Table 6 Colorful - Accent 5"/>
-    <w:basedOn w:val="665"/>
+    <w:basedOn w:val="887"/>
     <w:uiPriority w:val="99"/>
     <w:pPr>
       <w:pBdr/>
@@ -22804,9 +22890,9 @@
       </w:tcPr>
     </w:tblStylePr>
   </w:style>
-  <w:style w:type="table" w:styleId="109">
+  <w:style w:type="table" w:styleId="798">
     <w:name w:val="List Table 6 Colorful - Accent 6"/>
-    <w:basedOn w:val="665"/>
+    <w:basedOn w:val="887"/>
     <w:uiPriority w:val="99"/>
     <w:pPr>
       <w:pBdr/>
@@ -23027,9 +23113,9 @@
       </w:tcPr>
     </w:tblStylePr>
   </w:style>
-  <w:style w:type="table" w:styleId="110">
+  <w:style w:type="table" w:styleId="799">
     <w:name w:val="List Table 7 Colorful"/>
-    <w:basedOn w:val="665"/>
+    <w:basedOn w:val="887"/>
     <w:uiPriority w:val="99"/>
     <w:pPr>
       <w:pBdr/>
@@ -23128,11 +23214,11 @@
         <w:tblBorders/>
       </w:tblPr>
       <w:tcPr>
-        <w:shd w:color="ffffff"/>
+        <w:shd w:val="clear" w:color="ffffff"/>
         <w:tcBorders>
-          <w:top w:val="none"/>
-          <w:left w:val="none"/>
-          <w:bottom w:val="none"/>
+          <w:top w:val="none" w:color="000000" w:sz="4" w:space="0"/>
+          <w:left w:val="none" w:color="000000" w:sz="4" w:space="0"/>
+          <w:bottom w:val="none" w:color="000000" w:sz="4" w:space="0"/>
           <w:right w:val="single" w:color="000000" w:themeColor="text1" w:themeTint="80" w:sz="4" w:space="0"/>
         </w:tcBorders>
       </w:tcPr>
@@ -23155,10 +23241,10 @@
       <w:tcPr>
         <w:shd w:val="clear" w:color="ffffff" w:themeColor="light1" w:fill="ffffff" w:themeFill="light1"/>
         <w:tcBorders>
-          <w:top w:val="none"/>
-          <w:left w:val="none"/>
+          <w:top w:val="none" w:color="000000" w:sz="4" w:space="0"/>
+          <w:left w:val="none" w:color="000000" w:sz="4" w:space="0"/>
           <w:bottom w:val="single" w:color="000000" w:themeColor="text1" w:themeTint="80" w:sz="4" w:space="0"/>
-          <w:right w:val="none"/>
+          <w:right w:val="none" w:color="000000" w:sz="4" w:space="0"/>
         </w:tcBorders>
       </w:tcPr>
     </w:tblStylePr>
@@ -23178,12 +23264,12 @@
         <w:tblBorders/>
       </w:tblPr>
       <w:tcPr>
-        <w:shd w:color="ffffff"/>
+        <w:shd w:val="clear" w:color="ffffff"/>
         <w:tcBorders>
-          <w:top w:val="none"/>
+          <w:top w:val="none" w:color="000000" w:sz="4" w:space="0"/>
           <w:left w:val="single" w:color="000000" w:themeColor="text1" w:themeTint="80" w:sz="4" w:space="0"/>
-          <w:bottom w:val="none"/>
-          <w:right w:val="none"/>
+          <w:bottom w:val="none" w:color="000000" w:sz="4" w:space="0"/>
+          <w:right w:val="none" w:color="000000" w:sz="4" w:space="0"/>
         </w:tcBorders>
       </w:tcPr>
     </w:tblStylePr>
@@ -23206,9 +23292,9 @@
         <w:shd w:val="clear" w:color="ffffff" w:themeColor="light1" w:fill="ffffff" w:themeFill="light1"/>
         <w:tcBorders>
           <w:top w:val="single" w:color="000000" w:themeColor="text1" w:themeTint="80" w:sz="4" w:space="0"/>
-          <w:left w:val="none"/>
-          <w:bottom w:val="none"/>
-          <w:right w:val="none"/>
+          <w:left w:val="none" w:color="000000" w:sz="4" w:space="0"/>
+          <w:bottom w:val="none" w:color="000000" w:sz="4" w:space="0"/>
+          <w:right w:val="none" w:color="000000" w:sz="4" w:space="0"/>
         </w:tcBorders>
       </w:tcPr>
     </w:tblStylePr>
@@ -23283,9 +23369,9 @@
       </w:tcPr>
     </w:tblStylePr>
   </w:style>
-  <w:style w:type="table" w:styleId="111">
+  <w:style w:type="table" w:styleId="800">
     <w:name w:val="List Table 7 Colorful - Accent 1"/>
-    <w:basedOn w:val="665"/>
+    <w:basedOn w:val="887"/>
     <w:uiPriority w:val="99"/>
     <w:pPr>
       <w:pBdr/>
@@ -23384,11 +23470,11 @@
         <w:tblBorders/>
       </w:tblPr>
       <w:tcPr>
-        <w:shd w:color="ffffff"/>
+        <w:shd w:val="clear" w:color="ffffff"/>
         <w:tcBorders>
-          <w:top w:val="none"/>
-          <w:left w:val="none"/>
-          <w:bottom w:val="none"/>
+          <w:top w:val="none" w:color="000000" w:sz="4" w:space="0"/>
+          <w:left w:val="none" w:color="000000" w:sz="4" w:space="0"/>
+          <w:bottom w:val="none" w:color="000000" w:sz="4" w:space="0"/>
           <w:right w:val="single" w:color="000000" w:themeColor="accent1" w:sz="4" w:space="0"/>
         </w:tcBorders>
       </w:tcPr>
@@ -23411,10 +23497,10 @@
       <w:tcPr>
         <w:shd w:val="clear" w:color="ffffff" w:themeColor="light1" w:fill="ffffff" w:themeFill="light1"/>
         <w:tcBorders>
-          <w:top w:val="none"/>
-          <w:left w:val="none"/>
+          <w:top w:val="none" w:color="000000" w:sz="4" w:space="0"/>
+          <w:left w:val="none" w:color="000000" w:sz="4" w:space="0"/>
           <w:bottom w:val="single" w:color="000000" w:themeColor="accent1" w:sz="4" w:space="0"/>
-          <w:right w:val="none"/>
+          <w:right w:val="none" w:color="000000" w:sz="4" w:space="0"/>
         </w:tcBorders>
       </w:tcPr>
     </w:tblStylePr>
@@ -23434,12 +23520,12 @@
         <w:tblBorders/>
       </w:tblPr>
       <w:tcPr>
-        <w:shd w:color="ffffff"/>
+        <w:shd w:val="clear" w:color="ffffff"/>
         <w:tcBorders>
-          <w:top w:val="none"/>
+          <w:top w:val="none" w:color="000000" w:sz="4" w:space="0"/>
           <w:left w:val="single" w:color="000000" w:themeColor="accent1" w:sz="4" w:space="0"/>
-          <w:bottom w:val="none"/>
-          <w:right w:val="none"/>
+          <w:bottom w:val="none" w:color="000000" w:sz="4" w:space="0"/>
+          <w:right w:val="none" w:color="000000" w:sz="4" w:space="0"/>
         </w:tcBorders>
       </w:tcPr>
     </w:tblStylePr>
@@ -23462,9 +23548,9 @@
         <w:shd w:val="clear" w:color="ffffff" w:themeColor="light1" w:fill="ffffff" w:themeFill="light1"/>
         <w:tcBorders>
           <w:top w:val="single" w:color="000000" w:themeColor="accent1" w:sz="4" w:space="0"/>
-          <w:left w:val="none"/>
-          <w:bottom w:val="none"/>
-          <w:right w:val="none"/>
+          <w:left w:val="none" w:color="000000" w:sz="4" w:space="0"/>
+          <w:bottom w:val="none" w:color="000000" w:sz="4" w:space="0"/>
+          <w:right w:val="none" w:color="000000" w:sz="4" w:space="0"/>
         </w:tcBorders>
       </w:tcPr>
     </w:tblStylePr>
@@ -23539,9 +23625,9 @@
       </w:tcPr>
     </w:tblStylePr>
   </w:style>
-  <w:style w:type="table" w:styleId="112">
+  <w:style w:type="table" w:styleId="801">
     <w:name w:val="List Table 7 Colorful - Accent 2"/>
-    <w:basedOn w:val="665"/>
+    <w:basedOn w:val="887"/>
     <w:uiPriority w:val="99"/>
     <w:pPr>
       <w:pBdr/>
@@ -23640,11 +23726,11 @@
         <w:tblBorders/>
       </w:tblPr>
       <w:tcPr>
-        <w:shd w:color="ffffff"/>
+        <w:shd w:val="clear" w:color="ffffff"/>
         <w:tcBorders>
-          <w:top w:val="none"/>
-          <w:left w:val="none"/>
-          <w:bottom w:val="none"/>
+          <w:top w:val="none" w:color="000000" w:sz="4" w:space="0"/>
+          <w:left w:val="none" w:color="000000" w:sz="4" w:space="0"/>
+          <w:bottom w:val="none" w:color="000000" w:sz="4" w:space="0"/>
           <w:right w:val="single" w:color="000000" w:themeColor="accent2" w:themeTint="97" w:sz="4" w:space="0"/>
         </w:tcBorders>
       </w:tcPr>
@@ -23667,10 +23753,10 @@
       <w:tcPr>
         <w:shd w:val="clear" w:color="ffffff" w:themeColor="light1" w:fill="ffffff" w:themeFill="light1"/>
         <w:tcBorders>
-          <w:top w:val="none"/>
-          <w:left w:val="none"/>
+          <w:top w:val="none" w:color="000000" w:sz="4" w:space="0"/>
+          <w:left w:val="none" w:color="000000" w:sz="4" w:space="0"/>
           <w:bottom w:val="single" w:color="000000" w:themeColor="accent2" w:themeTint="97" w:sz="4" w:space="0"/>
-          <w:right w:val="none"/>
+          <w:right w:val="none" w:color="000000" w:sz="4" w:space="0"/>
         </w:tcBorders>
       </w:tcPr>
     </w:tblStylePr>
@@ -23690,12 +23776,12 @@
         <w:tblBorders/>
       </w:tblPr>
       <w:tcPr>
-        <w:shd w:color="ffffff"/>
+        <w:shd w:val="clear" w:color="ffffff"/>
         <w:tcBorders>
-          <w:top w:val="none"/>
+          <w:top w:val="none" w:color="000000" w:sz="4" w:space="0"/>
           <w:left w:val="single" w:color="000000" w:themeColor="accent2" w:themeTint="97" w:sz="4" w:space="0"/>
-          <w:bottom w:val="none"/>
-          <w:right w:val="none"/>
+          <w:bottom w:val="none" w:color="000000" w:sz="4" w:space="0"/>
+          <w:right w:val="none" w:color="000000" w:sz="4" w:space="0"/>
         </w:tcBorders>
       </w:tcPr>
     </w:tblStylePr>
@@ -23718,9 +23804,9 @@
         <w:shd w:val="clear" w:color="ffffff" w:themeColor="light1" w:fill="ffffff" w:themeFill="light1"/>
         <w:tcBorders>
           <w:top w:val="single" w:color="000000" w:themeColor="accent2" w:themeTint="97" w:sz="4" w:space="0"/>
-          <w:left w:val="none"/>
-          <w:bottom w:val="none"/>
-          <w:right w:val="none"/>
+          <w:left w:val="none" w:color="000000" w:sz="4" w:space="0"/>
+          <w:bottom w:val="none" w:color="000000" w:sz="4" w:space="0"/>
+          <w:right w:val="none" w:color="000000" w:sz="4" w:space="0"/>
         </w:tcBorders>
       </w:tcPr>
     </w:tblStylePr>
@@ -23795,9 +23881,9 @@
       </w:tcPr>
     </w:tblStylePr>
   </w:style>
-  <w:style w:type="table" w:styleId="113">
+  <w:style w:type="table" w:styleId="802">
     <w:name w:val="List Table 7 Colorful - Accent 3"/>
-    <w:basedOn w:val="665"/>
+    <w:basedOn w:val="887"/>
     <w:uiPriority w:val="99"/>
     <w:pPr>
       <w:pBdr/>
@@ -23896,11 +23982,11 @@
         <w:tblBorders/>
       </w:tblPr>
       <w:tcPr>
-        <w:shd w:color="ffffff"/>
+        <w:shd w:val="clear" w:color="ffffff"/>
         <w:tcBorders>
-          <w:top w:val="none"/>
-          <w:left w:val="none"/>
-          <w:bottom w:val="none"/>
+          <w:top w:val="none" w:color="000000" w:sz="4" w:space="0"/>
+          <w:left w:val="none" w:color="000000" w:sz="4" w:space="0"/>
+          <w:bottom w:val="none" w:color="000000" w:sz="4" w:space="0"/>
           <w:right w:val="single" w:color="000000" w:themeColor="accent3" w:themeTint="98" w:sz="4" w:space="0"/>
         </w:tcBorders>
       </w:tcPr>
@@ -23923,10 +24009,10 @@
       <w:tcPr>
         <w:shd w:val="clear" w:color="ffffff" w:themeColor="light1" w:fill="ffffff" w:themeFill="light1"/>
         <w:tcBorders>
-          <w:top w:val="none"/>
-          <w:left w:val="none"/>
+          <w:top w:val="none" w:color="000000" w:sz="4" w:space="0"/>
+          <w:left w:val="none" w:color="000000" w:sz="4" w:space="0"/>
           <w:bottom w:val="single" w:color="000000" w:themeColor="accent3" w:themeTint="98" w:sz="4" w:space="0"/>
-          <w:right w:val="none"/>
+          <w:right w:val="none" w:color="000000" w:sz="4" w:space="0"/>
         </w:tcBorders>
       </w:tcPr>
     </w:tblStylePr>
@@ -23946,12 +24032,12 @@
         <w:tblBorders/>
       </w:tblPr>
       <w:tcPr>
-        <w:shd w:color="ffffff"/>
+        <w:shd w:val="clear" w:color="ffffff"/>
         <w:tcBorders>
-          <w:top w:val="none"/>
+          <w:top w:val="none" w:color="000000" w:sz="4" w:space="0"/>
           <w:left w:val="single" w:color="000000" w:themeColor="accent3" w:themeTint="98" w:sz="4" w:space="0"/>
-          <w:bottom w:val="none"/>
-          <w:right w:val="none"/>
+          <w:bottom w:val="none" w:color="000000" w:sz="4" w:space="0"/>
+          <w:right w:val="none" w:color="000000" w:sz="4" w:space="0"/>
         </w:tcBorders>
       </w:tcPr>
     </w:tblStylePr>
@@ -23974,9 +24060,9 @@
         <w:shd w:val="clear" w:color="ffffff" w:themeColor="light1" w:fill="ffffff" w:themeFill="light1"/>
         <w:tcBorders>
           <w:top w:val="single" w:color="000000" w:themeColor="accent3" w:themeTint="98" w:sz="4" w:space="0"/>
-          <w:left w:val="none"/>
-          <w:bottom w:val="none"/>
-          <w:right w:val="none"/>
+          <w:left w:val="none" w:color="000000" w:sz="4" w:space="0"/>
+          <w:bottom w:val="none" w:color="000000" w:sz="4" w:space="0"/>
+          <w:right w:val="none" w:color="000000" w:sz="4" w:space="0"/>
         </w:tcBorders>
       </w:tcPr>
     </w:tblStylePr>
@@ -24051,9 +24137,9 @@
       </w:tcPr>
     </w:tblStylePr>
   </w:style>
-  <w:style w:type="table" w:styleId="114">
+  <w:style w:type="table" w:styleId="803">
     <w:name w:val="List Table 7 Colorful - Accent 4"/>
-    <w:basedOn w:val="665"/>
+    <w:basedOn w:val="887"/>
     <w:uiPriority w:val="99"/>
     <w:pPr>
       <w:pBdr/>
@@ -24152,11 +24238,11 @@
         <w:tblBorders/>
       </w:tblPr>
       <w:tcPr>
-        <w:shd w:color="ffffff"/>
+        <w:shd w:val="clear" w:color="ffffff"/>
         <w:tcBorders>
-          <w:top w:val="none"/>
-          <w:left w:val="none"/>
-          <w:bottom w:val="none"/>
+          <w:top w:val="none" w:color="000000" w:sz="4" w:space="0"/>
+          <w:left w:val="none" w:color="000000" w:sz="4" w:space="0"/>
+          <w:bottom w:val="none" w:color="000000" w:sz="4" w:space="0"/>
           <w:right w:val="single" w:color="000000" w:themeColor="accent4" w:themeTint="9A" w:sz="4" w:space="0"/>
         </w:tcBorders>
       </w:tcPr>
@@ -24179,10 +24265,10 @@
       <w:tcPr>
         <w:shd w:val="clear" w:color="ffffff" w:themeColor="light1" w:fill="ffffff" w:themeFill="light1"/>
         <w:tcBorders>
-          <w:top w:val="none"/>
-          <w:left w:val="none"/>
+          <w:top w:val="none" w:color="000000" w:sz="4" w:space="0"/>
+          <w:left w:val="none" w:color="000000" w:sz="4" w:space="0"/>
           <w:bottom w:val="single" w:color="000000" w:themeColor="accent4" w:themeTint="9A" w:sz="4" w:space="0"/>
-          <w:right w:val="none"/>
+          <w:right w:val="none" w:color="000000" w:sz="4" w:space="0"/>
         </w:tcBorders>
       </w:tcPr>
     </w:tblStylePr>
@@ -24202,12 +24288,12 @@
         <w:tblBorders/>
       </w:tblPr>
       <w:tcPr>
-        <w:shd w:color="ffffff"/>
+        <w:shd w:val="clear" w:color="ffffff"/>
         <w:tcBorders>
-          <w:top w:val="none"/>
+          <w:top w:val="none" w:color="000000" w:sz="4" w:space="0"/>
           <w:left w:val="single" w:color="000000" w:themeColor="accent4" w:themeTint="9A" w:sz="4" w:space="0"/>
-          <w:bottom w:val="none"/>
-          <w:right w:val="none"/>
+          <w:bottom w:val="none" w:color="000000" w:sz="4" w:space="0"/>
+          <w:right w:val="none" w:color="000000" w:sz="4" w:space="0"/>
         </w:tcBorders>
       </w:tcPr>
     </w:tblStylePr>
@@ -24230,9 +24316,9 @@
         <w:shd w:val="clear" w:color="ffffff" w:themeColor="light1" w:fill="ffffff" w:themeFill="light1"/>
         <w:tcBorders>
           <w:top w:val="single" w:color="000000" w:themeColor="accent4" w:themeTint="9A" w:sz="4" w:space="0"/>
-          <w:left w:val="none"/>
-          <w:bottom w:val="none"/>
-          <w:right w:val="none"/>
+          <w:left w:val="none" w:color="000000" w:sz="4" w:space="0"/>
+          <w:bottom w:val="none" w:color="000000" w:sz="4" w:space="0"/>
+          <w:right w:val="none" w:color="000000" w:sz="4" w:space="0"/>
         </w:tcBorders>
       </w:tcPr>
     </w:tblStylePr>
@@ -24307,9 +24393,9 @@
       </w:tcPr>
     </w:tblStylePr>
   </w:style>
-  <w:style w:type="table" w:styleId="115">
+  <w:style w:type="table" w:styleId="804">
     <w:name w:val="List Table 7 Colorful - Accent 5"/>
-    <w:basedOn w:val="665"/>
+    <w:basedOn w:val="887"/>
     <w:uiPriority w:val="99"/>
     <w:pPr>
       <w:pBdr/>
@@ -24408,11 +24494,11 @@
         <w:tblBorders/>
       </w:tblPr>
       <w:tcPr>
-        <w:shd w:color="ffffff"/>
+        <w:shd w:val="clear" w:color="ffffff"/>
         <w:tcBorders>
-          <w:top w:val="none"/>
-          <w:left w:val="none"/>
-          <w:bottom w:val="none"/>
+          <w:top w:val="none" w:color="000000" w:sz="4" w:space="0"/>
+          <w:left w:val="none" w:color="000000" w:sz="4" w:space="0"/>
+          <w:bottom w:val="none" w:color="000000" w:sz="4" w:space="0"/>
           <w:right w:val="single" w:color="000000" w:themeColor="accent5" w:themeTint="9A" w:sz="4" w:space="0"/>
         </w:tcBorders>
       </w:tcPr>
@@ -24435,10 +24521,10 @@
       <w:tcPr>
         <w:shd w:val="clear" w:color="ffffff" w:themeColor="light1" w:fill="ffffff" w:themeFill="light1"/>
         <w:tcBorders>
-          <w:top w:val="none"/>
-          <w:left w:val="none"/>
+          <w:top w:val="none" w:color="000000" w:sz="4" w:space="0"/>
+          <w:left w:val="none" w:color="000000" w:sz="4" w:space="0"/>
           <w:bottom w:val="single" w:color="000000" w:themeColor="accent5" w:themeTint="9A" w:sz="4" w:space="0"/>
-          <w:right w:val="none"/>
+          <w:right w:val="none" w:color="000000" w:sz="4" w:space="0"/>
         </w:tcBorders>
       </w:tcPr>
     </w:tblStylePr>
@@ -24458,12 +24544,12 @@
         <w:tblBorders/>
       </w:tblPr>
       <w:tcPr>
-        <w:shd w:color="ffffff"/>
+        <w:shd w:val="clear" w:color="ffffff"/>
         <w:tcBorders>
-          <w:top w:val="none"/>
+          <w:top w:val="none" w:color="000000" w:sz="4" w:space="0"/>
           <w:left w:val="single" w:color="000000" w:themeColor="accent5" w:themeTint="9A" w:sz="4" w:space="0"/>
-          <w:bottom w:val="none"/>
-          <w:right w:val="none"/>
+          <w:bottom w:val="none" w:color="000000" w:sz="4" w:space="0"/>
+          <w:right w:val="none" w:color="000000" w:sz="4" w:space="0"/>
         </w:tcBorders>
       </w:tcPr>
     </w:tblStylePr>
@@ -24486,9 +24572,9 @@
         <w:shd w:val="clear" w:color="ffffff" w:themeColor="light1" w:fill="ffffff" w:themeFill="light1"/>
         <w:tcBorders>
           <w:top w:val="single" w:color="000000" w:themeColor="accent5" w:themeTint="9A" w:sz="4" w:space="0"/>
-          <w:left w:val="none"/>
-          <w:bottom w:val="none"/>
-          <w:right w:val="none"/>
+          <w:left w:val="none" w:color="000000" w:sz="4" w:space="0"/>
+          <w:bottom w:val="none" w:color="000000" w:sz="4" w:space="0"/>
+          <w:right w:val="none" w:color="000000" w:sz="4" w:space="0"/>
         </w:tcBorders>
       </w:tcPr>
     </w:tblStylePr>
@@ -24563,9 +24649,9 @@
       </w:tcPr>
     </w:tblStylePr>
   </w:style>
-  <w:style w:type="table" w:styleId="116">
+  <w:style w:type="table" w:styleId="805">
     <w:name w:val="List Table 7 Colorful - Accent 6"/>
-    <w:basedOn w:val="665"/>
+    <w:basedOn w:val="887"/>
     <w:uiPriority w:val="99"/>
     <w:pPr>
       <w:pBdr/>
@@ -24664,11 +24750,11 @@
         <w:tblBorders/>
       </w:tblPr>
       <w:tcPr>
-        <w:shd w:color="ffffff"/>
+        <w:shd w:val="clear" w:color="ffffff"/>
         <w:tcBorders>
-          <w:top w:val="none"/>
-          <w:left w:val="none"/>
-          <w:bottom w:val="none"/>
+          <w:top w:val="none" w:color="000000" w:sz="4" w:space="0"/>
+          <w:left w:val="none" w:color="000000" w:sz="4" w:space="0"/>
+          <w:bottom w:val="none" w:color="000000" w:sz="4" w:space="0"/>
           <w:right w:val="single" w:color="000000" w:themeColor="accent6" w:themeTint="98" w:sz="4" w:space="0"/>
         </w:tcBorders>
       </w:tcPr>
@@ -24691,10 +24777,10 @@
       <w:tcPr>
         <w:shd w:val="clear" w:color="ffffff" w:themeColor="light1" w:fill="ffffff" w:themeFill="light1"/>
         <w:tcBorders>
-          <w:top w:val="none"/>
-          <w:left w:val="none"/>
+          <w:top w:val="none" w:color="000000" w:sz="4" w:space="0"/>
+          <w:left w:val="none" w:color="000000" w:sz="4" w:space="0"/>
           <w:bottom w:val="single" w:color="000000" w:themeColor="accent6" w:themeTint="98" w:sz="4" w:space="0"/>
-          <w:right w:val="none"/>
+          <w:right w:val="none" w:color="000000" w:sz="4" w:space="0"/>
         </w:tcBorders>
       </w:tcPr>
     </w:tblStylePr>
@@ -24714,12 +24800,12 @@
         <w:tblBorders/>
       </w:tblPr>
       <w:tcPr>
-        <w:shd w:color="ffffff"/>
+        <w:shd w:val="clear" w:color="ffffff"/>
         <w:tcBorders>
-          <w:top w:val="none"/>
+          <w:top w:val="none" w:color="000000" w:sz="4" w:space="0"/>
           <w:left w:val="single" w:color="000000" w:themeColor="accent6" w:themeTint="98" w:sz="4" w:space="0"/>
-          <w:bottom w:val="none"/>
-          <w:right w:val="none"/>
+          <w:bottom w:val="none" w:color="000000" w:sz="4" w:space="0"/>
+          <w:right w:val="none" w:color="000000" w:sz="4" w:space="0"/>
         </w:tcBorders>
       </w:tcPr>
     </w:tblStylePr>
@@ -24742,9 +24828,9 @@
         <w:shd w:val="clear" w:color="ffffff" w:themeColor="light1" w:fill="ffffff" w:themeFill="light1"/>
         <w:tcBorders>
           <w:top w:val="single" w:color="000000" w:themeColor="accent6" w:themeTint="98" w:sz="4" w:space="0"/>
-          <w:left w:val="none"/>
-          <w:bottom w:val="none"/>
-          <w:right w:val="none"/>
+          <w:left w:val="none" w:color="000000" w:sz="4" w:space="0"/>
+          <w:bottom w:val="none" w:color="000000" w:sz="4" w:space="0"/>
+          <w:right w:val="none" w:color="000000" w:sz="4" w:space="0"/>
         </w:tcBorders>
       </w:tcPr>
     </w:tblStylePr>
@@ -24819,9 +24905,9 @@
       </w:tcPr>
     </w:tblStylePr>
   </w:style>
-  <w:style w:type="table" w:styleId="117">
+  <w:style w:type="table" w:styleId="806">
     <w:name w:val="Lined - Accent"/>
-    <w:basedOn w:val="665"/>
+    <w:basedOn w:val="887"/>
     <w:uiPriority w:val="99"/>
     <w:pPr>
       <w:pBdr/>
@@ -25056,9 +25142,9 @@
       </w:tcPr>
     </w:tblStylePr>
   </w:style>
-  <w:style w:type="table" w:styleId="118">
+  <w:style w:type="table" w:styleId="807">
     <w:name w:val="Lined - Accent 1"/>
-    <w:basedOn w:val="665"/>
+    <w:basedOn w:val="887"/>
     <w:uiPriority w:val="99"/>
     <w:pPr>
       <w:pBdr/>
@@ -25293,9 +25379,9 @@
       </w:tcPr>
     </w:tblStylePr>
   </w:style>
-  <w:style w:type="table" w:styleId="119">
+  <w:style w:type="table" w:styleId="808">
     <w:name w:val="Lined - Accent 2"/>
-    <w:basedOn w:val="665"/>
+    <w:basedOn w:val="887"/>
     <w:uiPriority w:val="99"/>
     <w:pPr>
       <w:pBdr/>
@@ -25530,9 +25616,9 @@
       </w:tcPr>
     </w:tblStylePr>
   </w:style>
-  <w:style w:type="table" w:styleId="120">
+  <w:style w:type="table" w:styleId="809">
     <w:name w:val="Lined - Accent 3"/>
-    <w:basedOn w:val="665"/>
+    <w:basedOn w:val="887"/>
     <w:uiPriority w:val="99"/>
     <w:pPr>
       <w:pBdr/>
@@ -25767,9 +25853,9 @@
       </w:tcPr>
     </w:tblStylePr>
   </w:style>
-  <w:style w:type="table" w:styleId="121">
+  <w:style w:type="table" w:styleId="810">
     <w:name w:val="Lined - Accent 4"/>
-    <w:basedOn w:val="665"/>
+    <w:basedOn w:val="887"/>
     <w:uiPriority w:val="99"/>
     <w:pPr>
       <w:pBdr/>
@@ -26004,9 +26090,9 @@
       </w:tcPr>
     </w:tblStylePr>
   </w:style>
-  <w:style w:type="table" w:styleId="122">
+  <w:style w:type="table" w:styleId="811">
     <w:name w:val="Lined - Accent 5"/>
-    <w:basedOn w:val="665"/>
+    <w:basedOn w:val="887"/>
     <w:uiPriority w:val="99"/>
     <w:pPr>
       <w:pBdr/>
@@ -26241,9 +26327,9 @@
       </w:tcPr>
     </w:tblStylePr>
   </w:style>
-  <w:style w:type="table" w:styleId="123">
+  <w:style w:type="table" w:styleId="812">
     <w:name w:val="Lined - Accent 6"/>
-    <w:basedOn w:val="665"/>
+    <w:basedOn w:val="887"/>
     <w:uiPriority w:val="99"/>
     <w:pPr>
       <w:pBdr/>
@@ -26478,9 +26564,9 @@
       </w:tcPr>
     </w:tblStylePr>
   </w:style>
-  <w:style w:type="table" w:styleId="124">
+  <w:style w:type="table" w:styleId="813">
     <w:name w:val="Bordered &amp; Lined - Accent"/>
-    <w:basedOn w:val="665"/>
+    <w:basedOn w:val="887"/>
     <w:uiPriority w:val="99"/>
     <w:pPr>
       <w:pBdr/>
@@ -26722,9 +26808,9 @@
       </w:tcPr>
     </w:tblStylePr>
   </w:style>
-  <w:style w:type="table" w:styleId="125">
+  <w:style w:type="table" w:styleId="814">
     <w:name w:val="Bordered &amp; Lined - Accent 1"/>
-    <w:basedOn w:val="665"/>
+    <w:basedOn w:val="887"/>
     <w:uiPriority w:val="99"/>
     <w:pPr>
       <w:pBdr/>
@@ -26966,9 +27052,9 @@
       </w:tcPr>
     </w:tblStylePr>
   </w:style>
-  <w:style w:type="table" w:styleId="126">
+  <w:style w:type="table" w:styleId="815">
     <w:name w:val="Bordered &amp; Lined - Accent 2"/>
-    <w:basedOn w:val="665"/>
+    <w:basedOn w:val="887"/>
     <w:uiPriority w:val="99"/>
     <w:pPr>
       <w:pBdr/>
@@ -27210,9 +27296,9 @@
       </w:tcPr>
     </w:tblStylePr>
   </w:style>
-  <w:style w:type="table" w:styleId="127">
+  <w:style w:type="table" w:styleId="816">
     <w:name w:val="Bordered &amp; Lined - Accent 3"/>
-    <w:basedOn w:val="665"/>
+    <w:basedOn w:val="887"/>
     <w:uiPriority w:val="99"/>
     <w:pPr>
       <w:pBdr/>
@@ -27454,9 +27540,9 @@
       </w:tcPr>
     </w:tblStylePr>
   </w:style>
-  <w:style w:type="table" w:styleId="128">
+  <w:style w:type="table" w:styleId="817">
     <w:name w:val="Bordered &amp; Lined - Accent 4"/>
-    <w:basedOn w:val="665"/>
+    <w:basedOn w:val="887"/>
     <w:uiPriority w:val="99"/>
     <w:pPr>
       <w:pBdr/>
@@ -27698,9 +27784,9 @@
       </w:tcPr>
     </w:tblStylePr>
   </w:style>
-  <w:style w:type="table" w:styleId="129">
+  <w:style w:type="table" w:styleId="818">
     <w:name w:val="Bordered &amp; Lined - Accent 5"/>
-    <w:basedOn w:val="665"/>
+    <w:basedOn w:val="887"/>
     <w:uiPriority w:val="99"/>
     <w:pPr>
       <w:pBdr/>
@@ -27942,9 +28028,9 @@
       </w:tcPr>
     </w:tblStylePr>
   </w:style>
-  <w:style w:type="table" w:styleId="130">
+  <w:style w:type="table" w:styleId="819">
     <w:name w:val="Bordered &amp; Lined - Accent 6"/>
-    <w:basedOn w:val="665"/>
+    <w:basedOn w:val="887"/>
     <w:uiPriority w:val="99"/>
     <w:pPr>
       <w:pBdr/>
@@ -28186,9 +28272,9 @@
       </w:tcPr>
     </w:tblStylePr>
   </w:style>
-  <w:style w:type="table" w:styleId="131">
+  <w:style w:type="table" w:styleId="820">
     <w:name w:val="Bordered"/>
-    <w:basedOn w:val="665"/>
+    <w:basedOn w:val="887"/>
     <w:uiPriority w:val="99"/>
     <w:pPr>
       <w:pBdr/>
@@ -28417,9 +28503,9 @@
       </w:tcPr>
     </w:tblStylePr>
   </w:style>
-  <w:style w:type="table" w:styleId="132">
+  <w:style w:type="table" w:styleId="821">
     <w:name w:val="Bordered - Accent 1"/>
-    <w:basedOn w:val="665"/>
+    <w:basedOn w:val="887"/>
     <w:uiPriority w:val="99"/>
     <w:pPr>
       <w:pBdr/>
@@ -28648,9 +28734,9 @@
       </w:tcPr>
     </w:tblStylePr>
   </w:style>
-  <w:style w:type="table" w:styleId="133">
+  <w:style w:type="table" w:styleId="822">
     <w:name w:val="Bordered - Accent 2"/>
-    <w:basedOn w:val="665"/>
+    <w:basedOn w:val="887"/>
     <w:uiPriority w:val="99"/>
     <w:pPr>
       <w:pBdr/>
@@ -28879,9 +28965,9 @@
       </w:tcPr>
     </w:tblStylePr>
   </w:style>
-  <w:style w:type="table" w:styleId="134">
+  <w:style w:type="table" w:styleId="823">
     <w:name w:val="Bordered - Accent 3"/>
-    <w:basedOn w:val="665"/>
+    <w:basedOn w:val="887"/>
     <w:uiPriority w:val="99"/>
     <w:pPr>
       <w:pBdr/>
@@ -29110,9 +29196,9 @@
       </w:tcPr>
     </w:tblStylePr>
   </w:style>
-  <w:style w:type="table" w:styleId="135">
+  <w:style w:type="table" w:styleId="824">
     <w:name w:val="Bordered - Accent 4"/>
-    <w:basedOn w:val="665"/>
+    <w:basedOn w:val="887"/>
     <w:uiPriority w:val="99"/>
     <w:pPr>
       <w:pBdr/>
@@ -29341,9 +29427,9 @@
       </w:tcPr>
     </w:tblStylePr>
   </w:style>
-  <w:style w:type="table" w:styleId="136">
+  <w:style w:type="table" w:styleId="825">
     <w:name w:val="Bordered - Accent 5"/>
-    <w:basedOn w:val="665"/>
+    <w:basedOn w:val="887"/>
     <w:uiPriority w:val="99"/>
     <w:pPr>
       <w:pBdr/>
@@ -29572,9 +29658,9 @@
       </w:tcPr>
     </w:tblStylePr>
   </w:style>
-  <w:style w:type="table" w:styleId="137">
+  <w:style w:type="table" w:styleId="826">
     <w:name w:val="Bordered - Accent 6"/>
-    <w:basedOn w:val="665"/>
+    <w:basedOn w:val="887"/>
     <w:uiPriority w:val="99"/>
     <w:pPr>
       <w:pBdr/>
@@ -29803,11 +29889,11 @@
       </w:tcPr>
     </w:tblStylePr>
   </w:style>
-  <w:style w:type="paragraph" w:styleId="139">
+  <w:style w:type="paragraph" w:styleId="827">
     <w:name w:val="Heading 1"/>
-    <w:basedOn w:val="664"/>
-    <w:next w:val="664"/>
-    <w:link w:val="150"/>
+    <w:basedOn w:val="886"/>
+    <w:next w:val="886"/>
+    <w:link w:val="837"/>
     <w:uiPriority w:val="9"/>
     <w:qFormat/>
     <w:pPr>
@@ -29825,11 +29911,11 @@
       <w:szCs w:val="40"/>
     </w:rPr>
   </w:style>
-  <w:style w:type="paragraph" w:styleId="140">
+  <w:style w:type="paragraph" w:styleId="828">
     <w:name w:val="Heading 2"/>
-    <w:basedOn w:val="664"/>
-    <w:next w:val="664"/>
-    <w:link w:val="151"/>
+    <w:basedOn w:val="886"/>
+    <w:next w:val="886"/>
+    <w:link w:val="838"/>
     <w:uiPriority w:val="9"/>
     <w:unhideWhenUsed/>
     <w:qFormat/>
@@ -29848,11 +29934,11 @@
       <w:szCs w:val="32"/>
     </w:rPr>
   </w:style>
-  <w:style w:type="paragraph" w:styleId="141">
+  <w:style w:type="paragraph" w:styleId="829">
     <w:name w:val="Heading 3"/>
-    <w:basedOn w:val="664"/>
-    <w:next w:val="664"/>
-    <w:link w:val="152"/>
+    <w:basedOn w:val="886"/>
+    <w:next w:val="886"/>
+    <w:link w:val="839"/>
     <w:uiPriority w:val="9"/>
     <w:unhideWhenUsed/>
     <w:qFormat/>
@@ -29871,11 +29957,11 @@
       <w:szCs w:val="28"/>
     </w:rPr>
   </w:style>
-  <w:style w:type="paragraph" w:styleId="142">
+  <w:style w:type="paragraph" w:styleId="830">
     <w:name w:val="Heading 4"/>
-    <w:basedOn w:val="664"/>
-    <w:next w:val="664"/>
-    <w:link w:val="153"/>
+    <w:basedOn w:val="886"/>
+    <w:next w:val="886"/>
+    <w:link w:val="840"/>
     <w:uiPriority w:val="9"/>
     <w:unhideWhenUsed/>
     <w:qFormat/>
@@ -29894,11 +29980,11 @@
       <w:color w:val="0f4761" w:themeColor="accent1" w:themeShade="BF"/>
     </w:rPr>
   </w:style>
-  <w:style w:type="paragraph" w:styleId="143">
+  <w:style w:type="paragraph" w:styleId="831">
     <w:name w:val="Heading 5"/>
-    <w:basedOn w:val="664"/>
-    <w:next w:val="664"/>
-    <w:link w:val="154"/>
+    <w:basedOn w:val="886"/>
+    <w:next w:val="886"/>
+    <w:link w:val="841"/>
     <w:uiPriority w:val="9"/>
     <w:unhideWhenUsed/>
     <w:qFormat/>
@@ -29915,11 +30001,11 @@
       <w:color w:val="0f4761" w:themeColor="accent1" w:themeShade="BF"/>
     </w:rPr>
   </w:style>
-  <w:style w:type="paragraph" w:styleId="144">
+  <w:style w:type="paragraph" w:styleId="832">
     <w:name w:val="Heading 6"/>
-    <w:basedOn w:val="664"/>
-    <w:next w:val="664"/>
-    <w:link w:val="155"/>
+    <w:basedOn w:val="886"/>
+    <w:next w:val="886"/>
+    <w:link w:val="842"/>
     <w:uiPriority w:val="9"/>
     <w:unhideWhenUsed/>
     <w:qFormat/>
@@ -29938,11 +30024,11 @@
       <w:color w:val="595959" w:themeColor="text1" w:themeTint="A6"/>
     </w:rPr>
   </w:style>
-  <w:style w:type="paragraph" w:styleId="145">
+  <w:style w:type="paragraph" w:styleId="833">
     <w:name w:val="Heading 7"/>
-    <w:basedOn w:val="664"/>
-    <w:next w:val="664"/>
-    <w:link w:val="156"/>
+    <w:basedOn w:val="886"/>
+    <w:next w:val="886"/>
+    <w:link w:val="843"/>
     <w:uiPriority w:val="9"/>
     <w:unhideWhenUsed/>
     <w:qFormat/>
@@ -29959,11 +30045,11 @@
       <w:color w:val="595959" w:themeColor="text1" w:themeTint="A6"/>
     </w:rPr>
   </w:style>
-  <w:style w:type="paragraph" w:styleId="146">
+  <w:style w:type="paragraph" w:styleId="834">
     <w:name w:val="Heading 8"/>
-    <w:basedOn w:val="664"/>
-    <w:next w:val="664"/>
-    <w:link w:val="157"/>
+    <w:basedOn w:val="886"/>
+    <w:next w:val="886"/>
+    <w:link w:val="844"/>
     <w:uiPriority w:val="9"/>
     <w:unhideWhenUsed/>
     <w:qFormat/>
@@ -29982,11 +30068,11 @@
       <w:color w:val="272727" w:themeColor="text1" w:themeTint="D8"/>
     </w:rPr>
   </w:style>
-  <w:style w:type="paragraph" w:styleId="147">
+  <w:style w:type="paragraph" w:styleId="835">
     <w:name w:val="Heading 9"/>
-    <w:basedOn w:val="664"/>
-    <w:next w:val="664"/>
-    <w:link w:val="158"/>
+    <w:basedOn w:val="886"/>
+    <w:next w:val="886"/>
+    <w:link w:val="845"/>
     <w:uiPriority w:val="9"/>
     <w:unhideWhenUsed/>
     <w:qFormat/>
@@ -30005,7 +30091,7 @@
       <w:color w:val="272727" w:themeColor="text1" w:themeTint="D8"/>
     </w:rPr>
   </w:style>
-  <w:style w:type="character" w:styleId="148" w:default="1">
+  <w:style w:type="character" w:styleId="836" w:default="1">
     <w:name w:val="Default Paragraph Font"/>
     <w:uiPriority w:val="1"/>
     <w:semiHidden/>
@@ -30016,10 +30102,10 @@
       <w:ind/>
     </w:pPr>
   </w:style>
-  <w:style w:type="character" w:styleId="150">
+  <w:style w:type="character" w:styleId="837">
     <w:name w:val="Heading 1 Char"/>
-    <w:basedOn w:val="148"/>
-    <w:link w:val="139"/>
+    <w:basedOn w:val="836"/>
+    <w:link w:val="827"/>
     <w:uiPriority w:val="9"/>
     <w:pPr>
       <w:pBdr/>
@@ -30033,10 +30119,10 @@
       <w:szCs w:val="40"/>
     </w:rPr>
   </w:style>
-  <w:style w:type="character" w:styleId="151">
+  <w:style w:type="character" w:styleId="838">
     <w:name w:val="Heading 2 Char"/>
-    <w:basedOn w:val="148"/>
-    <w:link w:val="140"/>
+    <w:basedOn w:val="836"/>
+    <w:link w:val="828"/>
     <w:uiPriority w:val="9"/>
     <w:pPr>
       <w:pBdr/>
@@ -30050,10 +30136,10 @@
       <w:szCs w:val="32"/>
     </w:rPr>
   </w:style>
-  <w:style w:type="character" w:styleId="152">
+  <w:style w:type="character" w:styleId="839">
     <w:name w:val="Heading 3 Char"/>
-    <w:basedOn w:val="148"/>
-    <w:link w:val="141"/>
+    <w:basedOn w:val="836"/>
+    <w:link w:val="829"/>
     <w:uiPriority w:val="9"/>
     <w:pPr>
       <w:pBdr/>
@@ -30067,10 +30153,10 @@
       <w:szCs w:val="28"/>
     </w:rPr>
   </w:style>
-  <w:style w:type="character" w:styleId="153">
+  <w:style w:type="character" w:styleId="840">
     <w:name w:val="Heading 4 Char"/>
-    <w:basedOn w:val="148"/>
-    <w:link w:val="142"/>
+    <w:basedOn w:val="836"/>
+    <w:link w:val="830"/>
     <w:uiPriority w:val="9"/>
     <w:pPr>
       <w:pBdr/>
@@ -30084,10 +30170,10 @@
       <w:color w:val="0f4761" w:themeColor="accent1" w:themeShade="BF"/>
     </w:rPr>
   </w:style>
-  <w:style w:type="character" w:styleId="154">
+  <w:style w:type="character" w:styleId="841">
     <w:name w:val="Heading 5 Char"/>
-    <w:basedOn w:val="148"/>
-    <w:link w:val="143"/>
+    <w:basedOn w:val="836"/>
+    <w:link w:val="831"/>
     <w:uiPriority w:val="9"/>
     <w:pPr>
       <w:pBdr/>
@@ -30099,10 +30185,10 @@
       <w:color w:val="0f4761" w:themeColor="accent1" w:themeShade="BF"/>
     </w:rPr>
   </w:style>
-  <w:style w:type="character" w:styleId="155">
+  <w:style w:type="character" w:styleId="842">
     <w:name w:val="Heading 6 Char"/>
-    <w:basedOn w:val="148"/>
-    <w:link w:val="144"/>
+    <w:basedOn w:val="836"/>
+    <w:link w:val="832"/>
     <w:uiPriority w:val="9"/>
     <w:pPr>
       <w:pBdr/>
@@ -30116,10 +30202,10 @@
       <w:color w:val="595959" w:themeColor="text1" w:themeTint="A6"/>
     </w:rPr>
   </w:style>
-  <w:style w:type="character" w:styleId="156">
+  <w:style w:type="character" w:styleId="843">
     <w:name w:val="Heading 7 Char"/>
-    <w:basedOn w:val="148"/>
-    <w:link w:val="145"/>
+    <w:basedOn w:val="836"/>
+    <w:link w:val="833"/>
     <w:uiPriority w:val="9"/>
     <w:pPr>
       <w:pBdr/>
@@ -30131,10 +30217,10 @@
       <w:color w:val="595959" w:themeColor="text1" w:themeTint="A6"/>
     </w:rPr>
   </w:style>
-  <w:style w:type="character" w:styleId="157">
+  <w:style w:type="character" w:styleId="844">
     <w:name w:val="Heading 8 Char"/>
-    <w:basedOn w:val="148"/>
-    <w:link w:val="146"/>
+    <w:basedOn w:val="836"/>
+    <w:link w:val="834"/>
     <w:uiPriority w:val="9"/>
     <w:pPr>
       <w:pBdr/>
@@ -30148,10 +30234,10 @@
       <w:color w:val="272727" w:themeColor="text1" w:themeTint="D8"/>
     </w:rPr>
   </w:style>
-  <w:style w:type="character" w:styleId="158">
+  <w:style w:type="character" w:styleId="845">
     <w:name w:val="Heading 9 Char"/>
-    <w:basedOn w:val="148"/>
-    <w:link w:val="147"/>
+    <w:basedOn w:val="836"/>
+    <w:link w:val="835"/>
     <w:uiPriority w:val="9"/>
     <w:pPr>
       <w:pBdr/>
@@ -30165,11 +30251,11 @@
       <w:color w:val="272727" w:themeColor="text1" w:themeTint="D8"/>
     </w:rPr>
   </w:style>
-  <w:style w:type="paragraph" w:styleId="159">
+  <w:style w:type="paragraph" w:styleId="846">
     <w:name w:val="Title"/>
-    <w:basedOn w:val="664"/>
-    <w:next w:val="664"/>
-    <w:link w:val="160"/>
+    <w:basedOn w:val="886"/>
+    <w:next w:val="886"/>
+    <w:link w:val="847"/>
     <w:uiPriority w:val="10"/>
     <w:qFormat/>
     <w:pPr>
@@ -30185,10 +30271,10 @@
       <w:szCs w:val="56"/>
     </w:rPr>
   </w:style>
-  <w:style w:type="character" w:styleId="160">
+  <w:style w:type="character" w:styleId="847">
     <w:name w:val="Title Char"/>
-    <w:basedOn w:val="148"/>
-    <w:link w:val="159"/>
+    <w:basedOn w:val="836"/>
+    <w:link w:val="846"/>
     <w:uiPriority w:val="10"/>
     <w:pPr>
       <w:pBdr/>
@@ -30202,11 +30288,11 @@
       <w:szCs w:val="56"/>
     </w:rPr>
   </w:style>
-  <w:style w:type="paragraph" w:styleId="161">
+  <w:style w:type="paragraph" w:styleId="848">
     <w:name w:val="Subtitle"/>
-    <w:basedOn w:val="664"/>
-    <w:next w:val="664"/>
-    <w:link w:val="162"/>
+    <w:basedOn w:val="886"/>
+    <w:next w:val="886"/>
+    <w:link w:val="849"/>
     <w:uiPriority w:val="11"/>
     <w:qFormat/>
     <w:pPr>
@@ -30224,10 +30310,10 @@
       <w:szCs w:val="28"/>
     </w:rPr>
   </w:style>
-  <w:style w:type="character" w:styleId="162">
+  <w:style w:type="character" w:styleId="849">
     <w:name w:val="Subtitle Char"/>
-    <w:basedOn w:val="148"/>
-    <w:link w:val="161"/>
+    <w:basedOn w:val="836"/>
+    <w:link w:val="848"/>
     <w:uiPriority w:val="11"/>
     <w:pPr>
       <w:pBdr/>
@@ -30241,11 +30327,11 @@
       <w:szCs w:val="28"/>
     </w:rPr>
   </w:style>
-  <w:style w:type="paragraph" w:styleId="163">
+  <w:style w:type="paragraph" w:styleId="850">
     <w:name w:val="Quote"/>
-    <w:basedOn w:val="664"/>
-    <w:next w:val="664"/>
-    <w:link w:val="164"/>
+    <w:basedOn w:val="886"/>
+    <w:next w:val="886"/>
+    <w:link w:val="851"/>
     <w:uiPriority w:val="29"/>
     <w:qFormat/>
     <w:pPr>
@@ -30260,10 +30346,10 @@
       <w:color w:val="404040" w:themeColor="text1" w:themeTint="BF"/>
     </w:rPr>
   </w:style>
-  <w:style w:type="character" w:styleId="164">
+  <w:style w:type="character" w:styleId="851">
     <w:name w:val="Quote Char"/>
-    <w:basedOn w:val="148"/>
-    <w:link w:val="163"/>
+    <w:basedOn w:val="836"/>
+    <w:link w:val="850"/>
     <w:uiPriority w:val="29"/>
     <w:pPr>
       <w:pBdr/>
@@ -30276,9 +30362,9 @@
       <w:color w:val="404040" w:themeColor="text1" w:themeTint="BF"/>
     </w:rPr>
   </w:style>
-  <w:style w:type="character" w:styleId="166">
+  <w:style w:type="character" w:styleId="852">
     <w:name w:val="Intense Emphasis"/>
-    <w:basedOn w:val="148"/>
+    <w:basedOn w:val="836"/>
     <w:uiPriority w:val="21"/>
     <w:qFormat/>
     <w:pPr>
@@ -30292,11 +30378,11 @@
       <w:color w:val="0f4761" w:themeColor="accent1" w:themeShade="BF"/>
     </w:rPr>
   </w:style>
-  <w:style w:type="paragraph" w:styleId="167">
+  <w:style w:type="paragraph" w:styleId="853">
     <w:name w:val="Intense Quote"/>
-    <w:basedOn w:val="664"/>
-    <w:next w:val="664"/>
-    <w:link w:val="168"/>
+    <w:basedOn w:val="886"/>
+    <w:next w:val="886"/>
+    <w:link w:val="854"/>
     <w:uiPriority w:val="30"/>
     <w:qFormat/>
     <w:pPr>
@@ -30314,10 +30400,10 @@
       <w:color w:val="0f4761" w:themeColor="accent1" w:themeShade="BF"/>
     </w:rPr>
   </w:style>
-  <w:style w:type="character" w:styleId="168">
+  <w:style w:type="character" w:styleId="854">
     <w:name w:val="Intense Quote Char"/>
-    <w:basedOn w:val="148"/>
-    <w:link w:val="167"/>
+    <w:basedOn w:val="836"/>
+    <w:link w:val="853"/>
     <w:uiPriority w:val="30"/>
     <w:pPr>
       <w:pBdr/>
@@ -30330,9 +30416,9 @@
       <w:color w:val="0f4761" w:themeColor="accent1" w:themeShade="BF"/>
     </w:rPr>
   </w:style>
-  <w:style w:type="character" w:styleId="169">
+  <w:style w:type="character" w:styleId="855">
     <w:name w:val="Intense Reference"/>
-    <w:basedOn w:val="148"/>
+    <w:basedOn w:val="836"/>
     <w:uiPriority w:val="32"/>
     <w:qFormat/>
     <w:pPr>
@@ -30348,9 +30434,9 @@
       <w:spacing w:val="5"/>
     </w:rPr>
   </w:style>
-  <w:style w:type="character" w:styleId="171">
+  <w:style w:type="character" w:styleId="856">
     <w:name w:val="Subtle Emphasis"/>
-    <w:basedOn w:val="148"/>
+    <w:basedOn w:val="836"/>
     <w:uiPriority w:val="19"/>
     <w:qFormat/>
     <w:pPr>
@@ -30364,9 +30450,9 @@
       <w:color w:val="404040" w:themeColor="text1" w:themeTint="BF"/>
     </w:rPr>
   </w:style>
-  <w:style w:type="character" w:styleId="172">
+  <w:style w:type="character" w:styleId="857">
     <w:name w:val="Emphasis"/>
-    <w:basedOn w:val="148"/>
+    <w:basedOn w:val="836"/>
     <w:uiPriority w:val="20"/>
     <w:qFormat/>
     <w:pPr>
@@ -30379,9 +30465,9 @@
       <w:iCs/>
     </w:rPr>
   </w:style>
-  <w:style w:type="character" w:styleId="173">
+  <w:style w:type="character" w:styleId="858">
     <w:name w:val="Strong"/>
-    <w:basedOn w:val="148"/>
+    <w:basedOn w:val="836"/>
     <w:uiPriority w:val="22"/>
     <w:qFormat/>
     <w:pPr>
@@ -30394,9 +30480,9 @@
       <w:bCs/>
     </w:rPr>
   </w:style>
-  <w:style w:type="character" w:styleId="174">
+  <w:style w:type="character" w:styleId="859">
     <w:name w:val="Subtle Reference"/>
-    <w:basedOn w:val="148"/>
+    <w:basedOn w:val="836"/>
     <w:uiPriority w:val="31"/>
     <w:qFormat/>
     <w:pPr>
@@ -30409,9 +30495,9 @@
       <w:color w:val="5a5a5a" w:themeColor="text1" w:themeTint="A5"/>
     </w:rPr>
   </w:style>
-  <w:style w:type="character" w:styleId="175">
+  <w:style w:type="character" w:styleId="860">
     <w:name w:val="Book Title"/>
-    <w:basedOn w:val="148"/>
+    <w:basedOn w:val="836"/>
     <w:uiPriority w:val="33"/>
     <w:qFormat/>
     <w:pPr>
@@ -30427,10 +30513,10 @@
       <w:spacing w:val="5"/>
     </w:rPr>
   </w:style>
-  <w:style w:type="paragraph" w:styleId="176">
+  <w:style w:type="paragraph" w:styleId="861">
     <w:name w:val="Header"/>
-    <w:basedOn w:val="664"/>
-    <w:link w:val="177"/>
+    <w:basedOn w:val="886"/>
+    <w:link w:val="862"/>
     <w:uiPriority w:val="99"/>
     <w:unhideWhenUsed/>
     <w:pPr>
@@ -30443,10 +30529,10 @@
       <w:ind/>
     </w:pPr>
   </w:style>
-  <w:style w:type="character" w:styleId="177">
+  <w:style w:type="character" w:styleId="862">
     <w:name w:val="Header Char"/>
-    <w:basedOn w:val="148"/>
-    <w:link w:val="176"/>
+    <w:basedOn w:val="836"/>
+    <w:link w:val="861"/>
     <w:uiPriority w:val="99"/>
     <w:pPr>
       <w:pBdr/>
@@ -30454,10 +30540,10 @@
       <w:ind/>
     </w:pPr>
   </w:style>
-  <w:style w:type="paragraph" w:styleId="178">
+  <w:style w:type="paragraph" w:styleId="863">
     <w:name w:val="Footer"/>
-    <w:basedOn w:val="664"/>
-    <w:link w:val="179"/>
+    <w:basedOn w:val="886"/>
+    <w:link w:val="864"/>
     <w:uiPriority w:val="99"/>
     <w:unhideWhenUsed/>
     <w:pPr>
@@ -30470,10 +30556,10 @@
       <w:ind/>
     </w:pPr>
   </w:style>
-  <w:style w:type="character" w:styleId="179">
+  <w:style w:type="character" w:styleId="864">
     <w:name w:val="Footer Char"/>
-    <w:basedOn w:val="148"/>
-    <w:link w:val="178"/>
+    <w:basedOn w:val="836"/>
+    <w:link w:val="863"/>
     <w:uiPriority w:val="99"/>
     <w:pPr>
       <w:pBdr/>
@@ -30481,10 +30567,10 @@
       <w:ind/>
     </w:pPr>
   </w:style>
-  <w:style w:type="paragraph" w:styleId="180">
+  <w:style w:type="paragraph" w:styleId="865">
     <w:name w:val="Caption"/>
-    <w:basedOn w:val="664"/>
-    <w:next w:val="664"/>
+    <w:basedOn w:val="886"/>
+    <w:next w:val="886"/>
     <w:uiPriority w:val="35"/>
     <w:unhideWhenUsed/>
     <w:qFormat/>
@@ -30501,10 +30587,10 @@
       <w:szCs w:val="18"/>
     </w:rPr>
   </w:style>
-  <w:style w:type="paragraph" w:styleId="181">
+  <w:style w:type="paragraph" w:styleId="866">
     <w:name w:val="footnote text"/>
-    <w:basedOn w:val="664"/>
-    <w:link w:val="182"/>
+    <w:basedOn w:val="886"/>
+    <w:link w:val="867"/>
     <w:uiPriority w:val="99"/>
     <w:semiHidden/>
     <w:unhideWhenUsed/>
@@ -30518,10 +30604,10 @@
       <w:szCs w:val="20"/>
     </w:rPr>
   </w:style>
-  <w:style w:type="character" w:styleId="182">
+  <w:style w:type="character" w:styleId="867">
     <w:name w:val="Footnote Text Char"/>
-    <w:basedOn w:val="148"/>
-    <w:link w:val="181"/>
+    <w:basedOn w:val="836"/>
+    <w:link w:val="866"/>
     <w:uiPriority w:val="99"/>
     <w:semiHidden/>
     <w:pPr>
@@ -30534,9 +30620,9 @@
       <w:szCs w:val="20"/>
     </w:rPr>
   </w:style>
-  <w:style w:type="character" w:styleId="183">
+  <w:style w:type="character" w:styleId="868">
     <w:name w:val="footnote reference"/>
-    <w:basedOn w:val="148"/>
+    <w:basedOn w:val="836"/>
     <w:uiPriority w:val="99"/>
     <w:semiHidden/>
     <w:unhideWhenUsed/>
@@ -30549,10 +30635,10 @@
       <w:vertAlign w:val="superscript"/>
     </w:rPr>
   </w:style>
-  <w:style w:type="paragraph" w:styleId="184">
+  <w:style w:type="paragraph" w:styleId="869">
     <w:name w:val="endnote text"/>
-    <w:basedOn w:val="664"/>
-    <w:link w:val="185"/>
+    <w:basedOn w:val="886"/>
+    <w:link w:val="870"/>
     <w:uiPriority w:val="99"/>
     <w:semiHidden/>
     <w:unhideWhenUsed/>
@@ -30566,10 +30652,10 @@
       <w:szCs w:val="20"/>
     </w:rPr>
   </w:style>
-  <w:style w:type="character" w:styleId="185">
+  <w:style w:type="character" w:styleId="870">
     <w:name w:val="Endnote Text Char"/>
-    <w:basedOn w:val="148"/>
-    <w:link w:val="184"/>
+    <w:basedOn w:val="836"/>
+    <w:link w:val="869"/>
     <w:uiPriority w:val="99"/>
     <w:semiHidden/>
     <w:pPr>
@@ -30582,9 +30668,9 @@
       <w:szCs w:val="20"/>
     </w:rPr>
   </w:style>
-  <w:style w:type="character" w:styleId="186">
+  <w:style w:type="character" w:styleId="871">
     <w:name w:val="endnote reference"/>
-    <w:basedOn w:val="148"/>
+    <w:basedOn w:val="836"/>
     <w:uiPriority w:val="99"/>
     <w:semiHidden/>
     <w:unhideWhenUsed/>
@@ -30597,9 +30683,9 @@
       <w:vertAlign w:val="superscript"/>
     </w:rPr>
   </w:style>
-  <w:style w:type="character" w:styleId="187">
+  <w:style w:type="character" w:styleId="872">
     <w:name w:val="Hyperlink"/>
-    <w:basedOn w:val="148"/>
+    <w:basedOn w:val="836"/>
     <w:uiPriority w:val="99"/>
     <w:unhideWhenUsed/>
     <w:pPr>
@@ -30612,9 +30698,9 @@
       <w:u w:val="single"/>
     </w:rPr>
   </w:style>
-  <w:style w:type="character" w:styleId="188">
+  <w:style w:type="character" w:styleId="873">
     <w:name w:val="FollowedHyperlink"/>
-    <w:basedOn w:val="148"/>
+    <w:basedOn w:val="836"/>
     <w:uiPriority w:val="99"/>
     <w:semiHidden/>
     <w:unhideWhenUsed/>
@@ -30628,10 +30714,10 @@
       <w:u w:val="single"/>
     </w:rPr>
   </w:style>
-  <w:style w:type="paragraph" w:styleId="189">
+  <w:style w:type="paragraph" w:styleId="874">
     <w:name w:val="toc 1"/>
-    <w:basedOn w:val="664"/>
-    <w:next w:val="664"/>
+    <w:basedOn w:val="886"/>
+    <w:next w:val="886"/>
     <w:uiPriority w:val="39"/>
     <w:unhideWhenUsed/>
     <w:pPr>
@@ -30640,10 +30726,10 @@
       <w:ind/>
     </w:pPr>
   </w:style>
-  <w:style w:type="paragraph" w:styleId="190">
+  <w:style w:type="paragraph" w:styleId="875">
     <w:name w:val="toc 2"/>
-    <w:basedOn w:val="664"/>
-    <w:next w:val="664"/>
+    <w:basedOn w:val="886"/>
+    <w:next w:val="886"/>
     <w:uiPriority w:val="39"/>
     <w:unhideWhenUsed/>
     <w:pPr>
@@ -30652,10 +30738,10 @@
       <w:ind w:left="220"/>
     </w:pPr>
   </w:style>
-  <w:style w:type="paragraph" w:styleId="191">
+  <w:style w:type="paragraph" w:styleId="876">
     <w:name w:val="toc 3"/>
-    <w:basedOn w:val="664"/>
-    <w:next w:val="664"/>
+    <w:basedOn w:val="886"/>
+    <w:next w:val="886"/>
     <w:uiPriority w:val="39"/>
     <w:unhideWhenUsed/>
     <w:pPr>
@@ -30664,10 +30750,10 @@
       <w:ind w:left="440"/>
     </w:pPr>
   </w:style>
-  <w:style w:type="paragraph" w:styleId="192">
+  <w:style w:type="paragraph" w:styleId="877">
     <w:name w:val="toc 4"/>
-    <w:basedOn w:val="664"/>
-    <w:next w:val="664"/>
+    <w:basedOn w:val="886"/>
+    <w:next w:val="886"/>
     <w:uiPriority w:val="39"/>
     <w:unhideWhenUsed/>
     <w:pPr>
@@ -30676,10 +30762,10 @@
       <w:ind w:left="660"/>
     </w:pPr>
   </w:style>
-  <w:style w:type="paragraph" w:styleId="193">
+  <w:style w:type="paragraph" w:styleId="878">
     <w:name w:val="toc 5"/>
-    <w:basedOn w:val="664"/>
-    <w:next w:val="664"/>
+    <w:basedOn w:val="886"/>
+    <w:next w:val="886"/>
     <w:uiPriority w:val="39"/>
     <w:unhideWhenUsed/>
     <w:pPr>
@@ -30688,10 +30774,10 @@
       <w:ind w:left="880"/>
     </w:pPr>
   </w:style>
-  <w:style w:type="paragraph" w:styleId="194">
+  <w:style w:type="paragraph" w:styleId="879">
     <w:name w:val="toc 6"/>
-    <w:basedOn w:val="664"/>
-    <w:next w:val="664"/>
+    <w:basedOn w:val="886"/>
+    <w:next w:val="886"/>
     <w:uiPriority w:val="39"/>
     <w:unhideWhenUsed/>
     <w:pPr>
@@ -30700,10 +30786,10 @@
       <w:ind w:left="1100"/>
     </w:pPr>
   </w:style>
-  <w:style w:type="paragraph" w:styleId="195">
+  <w:style w:type="paragraph" w:styleId="880">
     <w:name w:val="toc 7"/>
-    <w:basedOn w:val="664"/>
-    <w:next w:val="664"/>
+    <w:basedOn w:val="886"/>
+    <w:next w:val="886"/>
     <w:uiPriority w:val="39"/>
     <w:unhideWhenUsed/>
     <w:pPr>
@@ -30712,10 +30798,10 @@
       <w:ind w:left="1320"/>
     </w:pPr>
   </w:style>
-  <w:style w:type="paragraph" w:styleId="196">
+  <w:style w:type="paragraph" w:styleId="881">
     <w:name w:val="toc 8"/>
-    <w:basedOn w:val="664"/>
-    <w:next w:val="664"/>
+    <w:basedOn w:val="886"/>
+    <w:next w:val="886"/>
     <w:uiPriority w:val="39"/>
     <w:unhideWhenUsed/>
     <w:pPr>
@@ -30724,10 +30810,10 @@
       <w:ind w:left="1540"/>
     </w:pPr>
   </w:style>
-  <w:style w:type="paragraph" w:styleId="197">
+  <w:style w:type="paragraph" w:styleId="882">
     <w:name w:val="toc 9"/>
-    <w:basedOn w:val="664"/>
-    <w:next w:val="664"/>
+    <w:basedOn w:val="886"/>
+    <w:next w:val="886"/>
     <w:uiPriority w:val="39"/>
     <w:unhideWhenUsed/>
     <w:pPr>
@@ -30736,9 +30822,9 @@
       <w:ind w:left="1760"/>
     </w:pPr>
   </w:style>
-  <w:style w:type="character" w:styleId="198">
+  <w:style w:type="character" w:styleId="883">
     <w:name w:val="Placeholder Text"/>
-    <w:basedOn w:val="148"/>
+    <w:basedOn w:val="836"/>
     <w:uiPriority w:val="99"/>
     <w:semiHidden/>
     <w:pPr>
@@ -30750,7 +30836,7 @@
       <w:color w:val="666666"/>
     </w:rPr>
   </w:style>
-  <w:style w:type="paragraph" w:styleId="208">
+  <w:style w:type="paragraph" w:styleId="884">
     <w:name w:val="TOC Heading"/>
     <w:uiPriority w:val="39"/>
     <w:unhideWhenUsed/>
@@ -30760,10 +30846,10 @@
       <w:ind/>
     </w:pPr>
   </w:style>
-  <w:style w:type="paragraph" w:styleId="209">
+  <w:style w:type="paragraph" w:styleId="885">
     <w:name w:val="table of figures"/>
-    <w:basedOn w:val="664"/>
-    <w:next w:val="664"/>
+    <w:basedOn w:val="886"/>
+    <w:next w:val="886"/>
     <w:uiPriority w:val="99"/>
     <w:unhideWhenUsed/>
     <w:pPr>
@@ -30772,7 +30858,7 @@
       <w:ind/>
     </w:pPr>
   </w:style>
-  <w:style w:type="paragraph" w:styleId="664" w:default="1">
+  <w:style w:type="paragraph" w:styleId="886" w:default="1">
     <w:name w:val="Normal"/>
     <w:qFormat/>
     <w:pPr>
@@ -30781,7 +30867,7 @@
       <w:ind/>
     </w:pPr>
   </w:style>
-  <w:style w:type="table" w:styleId="665" w:default="1">
+  <w:style w:type="table" w:styleId="887" w:default="1">
     <w:name w:val="Normal Table"/>
     <w:uiPriority w:val="99"/>
     <w:semiHidden/>
@@ -30974,7 +31060,7 @@
       </w:tcPr>
     </w:tblStylePr>
   </w:style>
-  <w:style w:type="numbering" w:styleId="666" w:default="1">
+  <w:style w:type="numbering" w:styleId="888" w:default="1">
     <w:name w:val="No List"/>
     <w:uiPriority w:val="99"/>
     <w:semiHidden/>
@@ -30985,9 +31071,9 @@
       <w:ind/>
     </w:pPr>
   </w:style>
-  <w:style w:type="paragraph" w:styleId="667">
+  <w:style w:type="paragraph" w:styleId="889">
     <w:name w:val="No Spacing"/>
-    <w:basedOn w:val="664"/>
+    <w:basedOn w:val="886"/>
     <w:uiPriority w:val="1"/>
     <w:qFormat/>
     <w:pPr>
@@ -30996,9 +31082,9 @@
       <w:ind/>
     </w:pPr>
   </w:style>
-  <w:style w:type="paragraph" w:styleId="668">
+  <w:style w:type="paragraph" w:styleId="890">
     <w:name w:val="List Paragraph"/>
-    <w:basedOn w:val="664"/>
+    <w:basedOn w:val="886"/>
     <w:uiPriority w:val="34"/>
     <w:qFormat/>
     <w:pPr>

</xml_diff>

<commit_message>
Add GameData table to SQL
</commit_message>
<xml_diff>
--- a/server/SQL Database table formatting.docx
+++ b/server/SQL Database table formatting.docx
@@ -212,6 +212,185 @@
             </w:pPr>
             <w:r>
               <w:t xml:space="preserve">Username</w:t>
+            </w:r>
+            <w:r/>
+          </w:p>
+        </w:tc>
+      </w:tr>
+    </w:tbl>
+    <w:p>
+      <w:pPr>
+        <w:spacing/>
+        <w:ind/>
+        <w:rPr/>
+      </w:pPr>
+      <w:r/>
+      <w:r/>
+      <w:r/>
+    </w:p>
+    <w:tbl>
+      <w:tblPr>
+        <w:tblStyle w:val="701"/>
+        <w:tblW w:w="0" w:type="auto"/>
+        <w:tblBorders/>
+        <w:tblLook w:val="04A0" w:firstRow="1" w:lastRow="0" w:firstColumn="1" w:lastColumn="0" w:noHBand="0" w:noVBand="1"/>
+      </w:tblPr>
+      <w:tblGrid>
+        <w:gridCol w:w="2116"/>
+        <w:gridCol w:w="2481"/>
+        <w:gridCol w:w="2470"/>
+        <w:gridCol w:w="2293"/>
+        <w:gridCol w:w="2293"/>
+      </w:tblGrid>
+      <w:tr>
+        <w:trPr/>
+        <w:tc>
+          <w:tcPr>
+            <w:gridSpan w:val="5"/>
+            <w:tcBorders/>
+            <w:tcMar>
+              <w:left w:w="108" w:type="dxa"/>
+              <w:top w:w="144" w:type="dxa"/>
+              <w:right w:w="108" w:type="dxa"/>
+              <w:bottom w:w="144" w:type="dxa"/>
+            </w:tcMar>
+            <w:tcW w:w="9360" w:type="dxa"/>
+          </w:tcPr>
+          <w:p>
+            <w:pPr>
+              <w:spacing/>
+              <w:ind/>
+              <w:jc w:val="center"/>
+              <w:rPr/>
+            </w:pPr>
+            <w:r>
+              <w:t xml:space="preserve">GameData</w:t>
+            </w:r>
+            <w:r/>
+            <w:r/>
+            <w:r/>
+            <w:r/>
+          </w:p>
+        </w:tc>
+      </w:tr>
+      <w:tr>
+        <w:trPr/>
+        <w:tc>
+          <w:tcPr>
+            <w:tcBorders/>
+            <w:tcMar>
+              <w:left w:w="108" w:type="dxa"/>
+              <w:top w:w="144" w:type="dxa"/>
+              <w:right w:w="108" w:type="dxa"/>
+              <w:bottom w:w="144" w:type="dxa"/>
+            </w:tcMar>
+            <w:tcW w:w="2116" w:type="dxa"/>
+          </w:tcPr>
+          <w:p>
+            <w:pPr>
+              <w:spacing/>
+              <w:ind/>
+              <w:jc w:val="center"/>
+              <w:rPr/>
+            </w:pPr>
+            <w:r>
+              <w:t xml:space="preserve">GameID</w:t>
+            </w:r>
+            <w:r/>
+          </w:p>
+        </w:tc>
+        <w:tc>
+          <w:tcPr>
+            <w:tcBorders/>
+            <w:tcMar>
+              <w:left w:w="108" w:type="dxa"/>
+              <w:top w:w="144" w:type="dxa"/>
+              <w:right w:w="108" w:type="dxa"/>
+              <w:bottom w:w="144" w:type="dxa"/>
+            </w:tcMar>
+            <w:tcW w:w="2481" w:type="dxa"/>
+          </w:tcPr>
+          <w:p>
+            <w:pPr>
+              <w:spacing/>
+              <w:ind/>
+              <w:jc w:val="center"/>
+              <w:rPr/>
+            </w:pPr>
+            <w:r>
+              <w:t xml:space="preserve">WhiteUsername</w:t>
+            </w:r>
+            <w:r/>
+          </w:p>
+        </w:tc>
+        <w:tc>
+          <w:tcPr>
+            <w:tcBorders/>
+            <w:tcMar>
+              <w:left w:w="108" w:type="dxa"/>
+              <w:top w:w="144" w:type="dxa"/>
+              <w:right w:w="108" w:type="dxa"/>
+              <w:bottom w:w="144" w:type="dxa"/>
+            </w:tcMar>
+            <w:tcW w:w="2470" w:type="dxa"/>
+          </w:tcPr>
+          <w:p>
+            <w:pPr>
+              <w:spacing/>
+              <w:ind/>
+              <w:jc w:val="center"/>
+              <w:rPr/>
+            </w:pPr>
+            <w:r>
+              <w:t xml:space="preserve">BlackUsername</w:t>
+            </w:r>
+            <w:r/>
+          </w:p>
+        </w:tc>
+        <w:tc>
+          <w:tcPr>
+            <w:tcBorders/>
+            <w:tcMar>
+              <w:left w:w="108" w:type="dxa"/>
+              <w:top w:w="144" w:type="dxa"/>
+              <w:right w:w="108" w:type="dxa"/>
+              <w:bottom w:w="144" w:type="dxa"/>
+            </w:tcMar>
+            <w:tcW w:w="2293" w:type="dxa"/>
+          </w:tcPr>
+          <w:p>
+            <w:pPr>
+              <w:spacing/>
+              <w:ind/>
+              <w:jc w:val="center"/>
+              <w:rPr/>
+            </w:pPr>
+            <w:r>
+              <w:t xml:space="preserve">GameName</w:t>
+            </w:r>
+            <w:r/>
+          </w:p>
+        </w:tc>
+        <w:tc>
+          <w:tcPr>
+            <w:tcBorders/>
+            <w:tcMar>
+              <w:left w:w="108" w:type="dxa"/>
+              <w:top w:w="144" w:type="dxa"/>
+              <w:right w:w="108" w:type="dxa"/>
+              <w:bottom w:w="144" w:type="dxa"/>
+            </w:tcMar>
+            <w:tcW w:w="2293" w:type="dxa"/>
+          </w:tcPr>
+          <w:p>
+            <w:pPr>
+              <w:spacing/>
+              <w:ind/>
+              <w:jc w:val="center"/>
+              <w:rPr/>
+            </w:pPr>
+            <w:r>
+              <w:t xml:space="preserve">ChessGame</w:t>
             </w:r>
             <w:r/>
           </w:p>

</xml_diff>